<commit_message>
Consolidated report ES/EN in Word and PDF: continuous layout with page breaks only where a section title would be orphaned
Co-Authored-By: Claude Opus 5.5 <noreply@anthropic.com>
Claude-Session: https://claude.ai/code/session_0188QZHBkA8n5QL7BtmFakQg
</commit_message>
<xml_diff>
--- a/secciones/valuacion/documento/Mallplaza_Valuacion_EN.docx
+++ b/secciones/valuacion/documento/Mallplaza_Valuacion_EN.docx
@@ -857,7 +857,7 @@
                 <w:sz w:val="16"/>
                 <w:szCs w:val="16"/>
               </w:rPr>
-              <w:t xml:space="preserve">We pushed the thesis to its extremes. In a bear case (WACC +100 bp and the 75.8% historical-low margin) the target falls to CLP 1,712; in a bull case combining WACC −100 bp, g of 2.5%, the 81.3% peak margin and the cut in corporate tax to 23%, it rises to CLP 2,595, still 27% below the price. APV (CLP 1,894), a peso-bond Rf (~CLP 2,439) and other debt targets (DCF of CLP 1,819 to 1,894) lead to the same conclusion (Appendix [F]).</w:t>
+              <w:t xml:space="preserve">We pushed the thesis to its extremes. In a bear case (WACC +100 bp and the 75.8% quarterly-low margin) the target falls to CLP 1,713; in a bull case combining WACC −100 bp, g of 2.5%, the 81.3% quarterly-peak margin and the cut in corporate tax to 23%, it rises to CLP 2,627, still 26% below the price. APV (CLP 1,894), a peso-bond Rf (~CLP 2,439) and other debt targets (DCF of CLP 1,819 to 1,894) lead to the same conclusion (Appendix [F]).</w:t>
             </w:r>
           </w:p>
           <w:p>
@@ -917,7 +917,7 @@
                 <w:sz w:val="16"/>
                 <w:szCs w:val="16"/>
               </w:rPr>
-              <w:t xml:space="preserve">What we will watch: the Note 11 appraisal at each reporting date (the real discount rate is the bridge between our value and book), the spread of the company's UF bonds over their 3.6% coupon (at the latest issue's 4.33% effective rate, the WACC would rise 12 bp and the target would fall to CLP 2,042), the cut in corporate tax to 23% (+3.9% on the target, not yet included) and the AAA rating, which would likely come under pressure at 3.5x net debt/EBITDA. In short, the operating story is sound; it is the price of that story that no longer adds up.</w:t>
+              <w:t xml:space="preserve">What we will watch: the Note 11 appraisal at each reporting date (the real discount rate is the bridge between our value and book), the spread of the company's UF bonds over their 3.6% coupon (at the latest issue's 4.33% effective rate, the WACC would rise 12 bp and the target would fall to CLP 2,042), the cut in corporate tax to 23% (+5.1% on the target, not yet included) and the AAA rating, which would likely come under pressure at 3.5x net debt/EBITDA. In short, the operating story is sound; it is the price of that story that no longer adds up.</w:t>
             </w:r>
           </w:p>
         </w:tc>

</xml_diff>

<commit_message>
Valuation: add IRR (firm and shareholder, nominal and real), v3 model with TIR_Accionista, real/nominal labelling; new content marked
Co-Authored-By: Claude Sonnet 5.5 <noreply@anthropic.com>
Claude-Session: https://claude.ai/code/session_0188QZHBkA8n5QL7BtmFakQg
</commit_message>
<xml_diff>
--- a/secciones/valuacion/documento/Mallplaza_Valuacion_EN.docx
+++ b/secciones/valuacion/documento/Mallplaza_Valuacion_EN.docx
@@ -102,11 +102,51 @@
             <w:r>
               <w:rPr>
                 <w:rFonts w:ascii="Arial" w:cs="Arial" w:eastAsia="Arial" w:hAnsi="Arial"/>
-                <w:color w:val="1A1A1A"/>
-                <w:sz w:val="16"/>
-                <w:szCs w:val="16"/>
-              </w:rPr>
-              <w:t xml:space="preserve">In twelve months the stock rose from CLP 2,470 to 4,700 and now trades at CLP 3,555. None of our methods reaches that price: the DCF ranges from CLP 1,379 to 2,329 even with WACC ±100 bp and g between 2.5% and 4.0%, and the most favourable multiples fall short too (Figure 27). We give the DCF an 80% weight because Mallplaza is, at heart, a rent collector: 81.4% of revenue is rent and 93% of that is fixed. The 20% on multiples tests the model against what the market pays today, but with caution: Chile has only two direct peers, and neither captures the company's expansion plan or debt path.</w:t>
+                <w:b/>
+                <w:bCs/>
+                <w:color w:val="1A1A1A"/>
+                <w:sz w:val="12"/>
+                <w:szCs w:val="12"/>
+                <w:shd w:fill="ECB100" w:color="auto" w:val="clear"/>
+              </w:rPr>
+              <w:t xml:space="preserve">NEW</w:t>
+            </w:r>
+            <w:r>
+              <w:rPr>
+                <w:rFonts w:ascii="Arial" w:cs="Arial" w:eastAsia="Arial" w:hAnsi="Arial"/>
+                <w:color w:val="1A1A1A"/>
+                <w:sz w:val="16"/>
+                <w:szCs w:val="16"/>
+              </w:rPr>
+              <w:t xml:space="preserve"> </w:t>
+            </w:r>
+            <w:r>
+              <w:rPr>
+                <w:rFonts w:ascii="Arial" w:cs="Arial" w:eastAsia="Arial" w:hAnsi="Arial"/>
+                <w:color w:val="1A1A1A"/>
+                <w:sz w:val="16"/>
+                <w:szCs w:val="16"/>
+              </w:rPr>
+              <w:t xml:space="preserve">In twelve months the stock rose from CLP 2,470 to 4,700 and now trades at CLP 3,555. None of our methods reaches that price: the DCF ranges from CLP 1,379 to 2,329 even with WACC ±100 bp and g between 2.5% and 4.0%</w:t>
+            </w:r>
+            <w:r>
+              <w:rPr>
+                <w:rFonts w:ascii="Arial" w:cs="Arial" w:eastAsia="Arial" w:hAnsi="Arial"/>
+                <w:color w:val="1A1A1A"/>
+                <w:sz w:val="16"/>
+                <w:szCs w:val="16"/>
+                <w:shd w:fill="ECB100" w:color="auto" w:val="clear"/>
+              </w:rPr>
+              <w:t xml:space="preserve"> (nominal)</w:t>
+            </w:r>
+            <w:r>
+              <w:rPr>
+                <w:rFonts w:ascii="Arial" w:cs="Arial" w:eastAsia="Arial" w:hAnsi="Arial"/>
+                <w:color w:val="1A1A1A"/>
+                <w:sz w:val="16"/>
+                <w:szCs w:val="16"/>
+              </w:rPr>
+              <w:t xml:space="preserve">, and the most favourable multiples fall short too (Figure 27). We give the DCF an 80% weight because Mallplaza is, at heart, a rent collector: 81.4% of revenue is rent and 93% of that is fixed. The 20% on multiples tests the model against what the market pays today, but with caution: Chile has only two direct peers, and neither captures the company's expansion plan or debt path.</w:t>
             </w:r>
           </w:p>
           <w:p>
@@ -166,11 +206,89 @@
             <w:r>
               <w:rPr>
                 <w:rFonts w:ascii="Arial" w:cs="Arial" w:eastAsia="Arial" w:hAnsi="Arial"/>
-                <w:color w:val="1A1A1A"/>
-                <w:sz w:val="16"/>
-                <w:szCs w:val="16"/>
-              </w:rPr>
-              <w:t xml:space="preserve">That rate moves with the capital structure. Mallplaza uses its debt capacity to grow, as in 2024 after buying Open Plaza Peru (3.78x): we assume net debt/EBITDA rises from 2.36x to 3.5x by 2031, with 25 bp more real cost per turn, and that new debt (CLP 1.40 trillion) funds all capex while operating cash is distributed to shareholders. The nominal WACC thus moves from 10.54% in 2H26E to 10.41% in the terminal period (7.20% real): an 11.93% Ke (Rf 4.98%, relevered beta of 1.14 from a six-peer median of 0.94, ERP 4.14% and a 1.41% revenue-weighted CRP) and a 5.11% after-tax Kd based on the 3.6% real coupon of the latest bond (Appendix [Z]).</w:t>
+                <w:b/>
+                <w:bCs/>
+                <w:color w:val="1A1A1A"/>
+                <w:sz w:val="12"/>
+                <w:szCs w:val="12"/>
+                <w:shd w:fill="ECB100" w:color="auto" w:val="clear"/>
+              </w:rPr>
+              <w:t xml:space="preserve">NEW</w:t>
+            </w:r>
+            <w:r>
+              <w:rPr>
+                <w:rFonts w:ascii="Arial" w:cs="Arial" w:eastAsia="Arial" w:hAnsi="Arial"/>
+                <w:color w:val="1A1A1A"/>
+                <w:sz w:val="16"/>
+                <w:szCs w:val="16"/>
+              </w:rPr>
+              <w:t xml:space="preserve"> </w:t>
+            </w:r>
+            <w:r>
+              <w:rPr>
+                <w:rFonts w:ascii="Arial" w:cs="Arial" w:eastAsia="Arial" w:hAnsi="Arial"/>
+                <w:color w:val="1A1A1A"/>
+                <w:sz w:val="16"/>
+                <w:szCs w:val="16"/>
+              </w:rPr>
+              <w:t xml:space="preserve">That rate moves with the capital structure. Mallplaza uses its debt capacity to grow, as in 2024 after buying Open Plaza Peru (3.78x): we assume net debt/EBITDA rises from 2.36x to 3.5x by 2031, with 25 bp more real cost per turn, and that new debt (CLP 1.40 trillion) funds all capex while operating cash is distributed to shareholders. The nominal WACC thus moves from 10.54% in 2H26E to 10.41% in the terminal period (7.20% real): an </w:t>
+            </w:r>
+            <w:r>
+              <w:rPr>
+                <w:rFonts w:ascii="Arial" w:cs="Arial" w:eastAsia="Arial" w:hAnsi="Arial"/>
+                <w:color w:val="1A1A1A"/>
+                <w:sz w:val="16"/>
+                <w:szCs w:val="16"/>
+                <w:shd w:fill="ECB100" w:color="auto" w:val="clear"/>
+              </w:rPr>
+              <w:t xml:space="preserve">11.93% nominal Ke (8.67% real; Rf 4.98%</w:t>
+            </w:r>
+            <w:r>
+              <w:rPr>
+                <w:rFonts w:ascii="Arial" w:cs="Arial" w:eastAsia="Arial" w:hAnsi="Arial"/>
+                <w:color w:val="1A1A1A"/>
+                <w:sz w:val="16"/>
+                <w:szCs w:val="16"/>
+              </w:rPr>
+              <w:t xml:space="preserve">, relevered beta of 1.14 from a six-peer median of 0.94, ERP 4.14% and a 1.41% revenue-weighted CRP) and a </w:t>
+            </w:r>
+            <w:r>
+              <w:rPr>
+                <w:rFonts w:ascii="Arial" w:cs="Arial" w:eastAsia="Arial" w:hAnsi="Arial"/>
+                <w:color w:val="1A1A1A"/>
+                <w:sz w:val="16"/>
+                <w:szCs w:val="16"/>
+                <w:shd w:fill="ECB100" w:color="auto" w:val="clear"/>
+              </w:rPr>
+              <w:t xml:space="preserve">5.11% nominal after-tax Kd</w:t>
+            </w:r>
+            <w:r>
+              <w:rPr>
+                <w:rFonts w:ascii="Arial" w:cs="Arial" w:eastAsia="Arial" w:hAnsi="Arial"/>
+                <w:color w:val="1A1A1A"/>
+                <w:sz w:val="16"/>
+                <w:szCs w:val="16"/>
+              </w:rPr>
+              <w:t xml:space="preserve"> based on the </w:t>
+            </w:r>
+            <w:r>
+              <w:rPr>
+                <w:rFonts w:ascii="Arial" w:cs="Arial" w:eastAsia="Arial" w:hAnsi="Arial"/>
+                <w:color w:val="1A1A1A"/>
+                <w:sz w:val="16"/>
+                <w:szCs w:val="16"/>
+                <w:shd w:fill="ECB100" w:color="auto" w:val="clear"/>
+              </w:rPr>
+              <w:t xml:space="preserve">3.6% real (UF) coupon</w:t>
+            </w:r>
+            <w:r>
+              <w:rPr>
+                <w:rFonts w:ascii="Arial" w:cs="Arial" w:eastAsia="Arial" w:hAnsi="Arial"/>
+                <w:color w:val="1A1A1A"/>
+                <w:sz w:val="16"/>
+                <w:szCs w:val="16"/>
+              </w:rPr>
+              <w:t xml:space="preserve"> of the latest bond (Appendix [Z]).</w:t>
             </w:r>
           </w:p>
           <w:p>
@@ -181,11 +299,61 @@
             <w:r>
               <w:rPr>
                 <w:rFonts w:ascii="Arial" w:cs="Arial" w:eastAsia="Arial" w:hAnsi="Arial"/>
-                <w:color w:val="1A1A1A"/>
-                <w:sz w:val="16"/>
-                <w:szCs w:val="16"/>
-              </w:rPr>
-              <w:t xml:space="preserve">We build Ke in dollars because its three inputs are in that currency: the US Treasury Rf, the implied equity risk premium published by Damodaran and country risk, which we weight by revenue (71.8% Chile, 17.7% Peru and 10.5% Colombia). We then convert it to pesos with the gap between expected inflation in Chile (3.0%, the central bank's target) and in the US (2.24%, 10-year breakeven). The beta starts from unlevering six regional peers with Hamada and is relevered each period with Mallplaza's structure, which is why it moves from 1.09 in 2H26E to 1.14 in the terminal period.</w:t>
+                <w:b/>
+                <w:bCs/>
+                <w:color w:val="1A1A1A"/>
+                <w:sz w:val="12"/>
+                <w:szCs w:val="12"/>
+                <w:shd w:fill="ECB100" w:color="auto" w:val="clear"/>
+              </w:rPr>
+              <w:t xml:space="preserve">NEW</w:t>
+            </w:r>
+            <w:r>
+              <w:rPr>
+                <w:rFonts w:ascii="Arial" w:cs="Arial" w:eastAsia="Arial" w:hAnsi="Arial"/>
+                <w:color w:val="1A1A1A"/>
+                <w:sz w:val="16"/>
+                <w:szCs w:val="16"/>
+              </w:rPr>
+              <w:t xml:space="preserve"> </w:t>
+            </w:r>
+            <w:r>
+              <w:rPr>
+                <w:rFonts w:ascii="Arial" w:cs="Arial" w:eastAsia="Arial" w:hAnsi="Arial"/>
+                <w:color w:val="1A1A1A"/>
+                <w:sz w:val="16"/>
+                <w:szCs w:val="16"/>
+              </w:rPr>
+              <w:t xml:space="preserve">We build Ke in dollars because its three inputs are in that currency</w:t>
+            </w:r>
+            <w:r>
+              <w:rPr>
+                <w:rFonts w:ascii="Arial" w:cs="Arial" w:eastAsia="Arial" w:hAnsi="Arial"/>
+                <w:color w:val="1A1A1A"/>
+                <w:sz w:val="16"/>
+                <w:szCs w:val="16"/>
+                <w:shd w:fill="ECB100" w:color="auto" w:val="clear"/>
+              </w:rPr>
+              <w:t xml:space="preserve"> and are nominal</w:t>
+            </w:r>
+            <w:r>
+              <w:rPr>
+                <w:rFonts w:ascii="Arial" w:cs="Arial" w:eastAsia="Arial" w:hAnsi="Arial"/>
+                <w:color w:val="1A1A1A"/>
+                <w:sz w:val="16"/>
+                <w:szCs w:val="16"/>
+              </w:rPr>
+              <w:t xml:space="preserve">: the US Treasury Rf, the implied equity risk premium published by Damodaran and country risk, which we weight by revenue (71.8% Chile, 17.7% Peru and 10.5% Colombia). We then convert it to pesos with the gap between expected inflation in Chile (3.0%, the central bank's target) and in the US (2.24%, 10-year breakeven). </w:t>
+            </w:r>
+            <w:r>
+              <w:rPr>
+                <w:rFonts w:ascii="Arial" w:cs="Arial" w:eastAsia="Arial" w:hAnsi="Arial"/>
+                <w:color w:val="1A1A1A"/>
+                <w:sz w:val="16"/>
+                <w:szCs w:val="16"/>
+                <w:shd w:fill="ECB100" w:color="auto" w:val="clear"/>
+              </w:rPr>
+              <w:t xml:space="preserve">The beta is unlevered with Hamada (six regional peers) and relevered each period (1.09 in 2H26E, 1.14 in the terminal period).</w:t>
             </w:r>
           </w:p>
           <w:p>
@@ -196,11 +364,853 @@
             <w:r>
               <w:rPr>
                 <w:rFonts w:ascii="Arial" w:cs="Arial" w:eastAsia="Arial" w:hAnsi="Arial"/>
-                <w:color w:val="1A1A1A"/>
-                <w:sz w:val="16"/>
-                <w:szCs w:val="16"/>
-              </w:rPr>
-              <w:t xml:space="preserve">Here the first signal appears: at CLP 3,555, equity yields ~4.4% real, just 80 bp above the company's own real cost of debt (Figure 28). The market is pricing the stock almost as if it were a bond.</w:t>
+                <w:b/>
+                <w:bCs/>
+                <w:color w:val="1A1A1A"/>
+                <w:sz w:val="12"/>
+                <w:szCs w:val="12"/>
+                <w:shd w:fill="ECB100" w:color="auto" w:val="clear"/>
+              </w:rPr>
+              <w:t xml:space="preserve">NEW</w:t>
+            </w:r>
+            <w:r>
+              <w:rPr>
+                <w:rFonts w:ascii="Arial" w:cs="Arial" w:eastAsia="Arial" w:hAnsi="Arial"/>
+                <w:color w:val="1A1A1A"/>
+                <w:sz w:val="16"/>
+                <w:szCs w:val="16"/>
+              </w:rPr>
+              <w:t xml:space="preserve"> </w:t>
+            </w:r>
+            <w:r>
+              <w:rPr>
+                <w:rFonts w:ascii="Arial" w:cs="Arial" w:eastAsia="Arial" w:hAnsi="Arial"/>
+                <w:color w:val="1A1A1A"/>
+                <w:sz w:val="16"/>
+                <w:szCs w:val="16"/>
+                <w:shd w:fill="ECB100" w:color="auto" w:val="clear"/>
+              </w:rPr>
+              <w:t xml:space="preserve">The first signal is the IRR, what someone buying at CLP 3,555 earns if our cash flows come true: for the firm, 7.57% nominal (4.44% real in UF), 284 bp below its WACC and just ~80 bp real above its real cost of debt (Figure 28); for the shareholder, −2.0% nominal against a 11.93% Ke.</w:t>
+            </w:r>
+            <w:r>
+              <w:rPr>
+                <w:rFonts w:ascii="Arial" w:cs="Arial" w:eastAsia="Arial" w:hAnsi="Arial"/>
+                <w:color w:val="1A1A1A"/>
+                <w:sz w:val="16"/>
+                <w:szCs w:val="16"/>
+              </w:rPr>
+              <w:t xml:space="preserve"> The market is pricing the stock almost as if it were a bond.</w:t>
+            </w:r>
+          </w:p>
+          <w:p>
+            <w:pPr>
+              <w:keepNext/>
+              <w:spacing w:after="30" w:before="40" w:line="228" w:lineRule="auto"/>
+            </w:pPr>
+            <w:r>
+              <w:rPr>
+                <w:rFonts w:ascii="Arial" w:cs="Arial" w:eastAsia="Arial" w:hAnsi="Arial"/>
+                <w:b/>
+                <w:bCs/>
+                <w:color w:val="14284B"/>
+                <w:sz w:val="12"/>
+                <w:szCs w:val="12"/>
+                <w:shd w:fill="ECB100" w:color="auto" w:val="clear"/>
+              </w:rPr>
+              <w:t xml:space="preserve">NEW</w:t>
+            </w:r>
+            <w:r>
+              <w:rPr>
+                <w:rFonts w:ascii="Arial" w:cs="Arial" w:eastAsia="Arial" w:hAnsi="Arial"/>
+                <w:color w:val="14284B"/>
+                <w:sz w:val="14"/>
+                <w:szCs w:val="14"/>
+              </w:rPr>
+              <w:t xml:space="preserve"> </w:t>
+            </w:r>
+            <w:r>
+              <w:rPr>
+                <w:rFonts w:ascii="Arial" w:cs="Arial" w:eastAsia="Arial" w:hAnsi="Arial"/>
+                <w:b/>
+                <w:bCs/>
+                <w:color w:val="14284B"/>
+                <w:sz w:val="14"/>
+                <w:szCs w:val="14"/>
+                <w:shd w:fill="ECB100" w:color="auto" w:val="clear"/>
+              </w:rPr>
+              <w:t xml:space="preserve">IRR at the market price vs cost of capital: nominal CLP and real (UF)</w:t>
+            </w:r>
+          </w:p>
+          <w:tbl>
+            <w:tblPr>
+              <w:tblW w:type="dxa" w:w="6900"/>
+              <w:tblBorders>
+                <w:top w:val="none" w:color="FFFFFF" w:sz="0"/>
+                <w:left w:val="none" w:color="FFFFFF" w:sz="0"/>
+                <w:bottom w:val="none" w:color="FFFFFF" w:sz="0"/>
+                <w:right w:val="none" w:color="FFFFFF" w:sz="0"/>
+                <w:insideH w:val="none" w:color="FFFFFF" w:sz="0"/>
+                <w:insideV w:val="none" w:color="FFFFFF" w:sz="0"/>
+              </w:tblBorders>
+            </w:tblPr>
+            <w:tblGrid>
+              <w:gridCol w:w="2300"/>
+              <w:gridCol w:w="740"/>
+              <w:gridCol w:w="640"/>
+              <w:gridCol w:w="1800"/>
+              <w:gridCol w:w="1420"/>
+            </w:tblGrid>
+            <w:tr>
+              <w:trPr>
+                <w:tblHeader/>
+              </w:trPr>
+              <w:tc>
+                <w:tcPr>
+                  <w:tcW w:type="dxa" w:w="2300"/>
+                  <w:tcBorders>
+                    <w:top w:val="none" w:color="FFFFFF" w:sz="0"/>
+                    <w:left w:val="none" w:color="FFFFFF" w:sz="0"/>
+                    <w:bottom w:val="none" w:color="FFFFFF" w:sz="0"/>
+                    <w:right w:val="none" w:color="FFFFFF" w:sz="0"/>
+                  </w:tcBorders>
+                  <w:shd w:fill="14284B" w:color="auto" w:val="clear"/>
+                  <w:tcMar>
+                    <w:top w:type="dxa" w:w="35"/>
+                    <w:left w:type="dxa" w:w="80"/>
+                    <w:bottom w:type="dxa" w:w="35"/>
+                    <w:right w:type="dxa" w:w="80"/>
+                  </w:tcMar>
+                </w:tcPr>
+                <w:p>
+                  <w:pPr>
+                    <w:jc w:val="left"/>
+                  </w:pPr>
+                  <w:r>
+                    <w:rPr>
+                      <w:rFonts w:ascii="Arial" w:cs="Arial" w:eastAsia="Arial" w:hAnsi="Arial"/>
+                      <w:b/>
+                      <w:bCs/>
+                      <w:color w:val="FFFFFF"/>
+                      <w:sz w:val="13"/>
+                      <w:szCs w:val="13"/>
+                    </w:rPr>
+                    <w:t xml:space="preserve">Buying at CLP 3,555</w:t>
+                  </w:r>
+                </w:p>
+              </w:tc>
+              <w:tc>
+                <w:tcPr>
+                  <w:tcW w:type="dxa" w:w="740"/>
+                  <w:tcBorders>
+                    <w:top w:val="none" w:color="FFFFFF" w:sz="0"/>
+                    <w:left w:val="none" w:color="FFFFFF" w:sz="0"/>
+                    <w:bottom w:val="none" w:color="FFFFFF" w:sz="0"/>
+                    <w:right w:val="none" w:color="FFFFFF" w:sz="0"/>
+                  </w:tcBorders>
+                  <w:shd w:fill="14284B" w:color="auto" w:val="clear"/>
+                  <w:tcMar>
+                    <w:top w:type="dxa" w:w="35"/>
+                    <w:left w:type="dxa" w:w="80"/>
+                    <w:bottom w:type="dxa" w:w="35"/>
+                    <w:right w:type="dxa" w:w="80"/>
+                  </w:tcMar>
+                </w:tcPr>
+                <w:p>
+                  <w:pPr>
+                    <w:jc w:val="right"/>
+                  </w:pPr>
+                  <w:r>
+                    <w:rPr>
+                      <w:rFonts w:ascii="Arial" w:cs="Arial" w:eastAsia="Arial" w:hAnsi="Arial"/>
+                      <w:b/>
+                      <w:bCs/>
+                      <w:color w:val="FFFFFF"/>
+                      <w:sz w:val="13"/>
+                      <w:szCs w:val="13"/>
+                    </w:rPr>
+                    <w:t xml:space="preserve">Nominal</w:t>
+                  </w:r>
+                </w:p>
+              </w:tc>
+              <w:tc>
+                <w:tcPr>
+                  <w:tcW w:type="dxa" w:w="640"/>
+                  <w:tcBorders>
+                    <w:top w:val="none" w:color="FFFFFF" w:sz="0"/>
+                    <w:left w:val="none" w:color="FFFFFF" w:sz="0"/>
+                    <w:bottom w:val="none" w:color="FFFFFF" w:sz="0"/>
+                    <w:right w:val="none" w:color="FFFFFF" w:sz="0"/>
+                  </w:tcBorders>
+                  <w:shd w:fill="14284B" w:color="auto" w:val="clear"/>
+                  <w:tcMar>
+                    <w:top w:type="dxa" w:w="35"/>
+                    <w:left w:type="dxa" w:w="80"/>
+                    <w:bottom w:type="dxa" w:w="35"/>
+                    <w:right w:type="dxa" w:w="80"/>
+                  </w:tcMar>
+                </w:tcPr>
+                <w:p>
+                  <w:pPr>
+                    <w:jc w:val="right"/>
+                  </w:pPr>
+                  <w:r>
+                    <w:rPr>
+                      <w:rFonts w:ascii="Arial" w:cs="Arial" w:eastAsia="Arial" w:hAnsi="Arial"/>
+                      <w:b/>
+                      <w:bCs/>
+                      <w:color w:val="FFFFFF"/>
+                      <w:sz w:val="13"/>
+                      <w:szCs w:val="13"/>
+                    </w:rPr>
+                    <w:t xml:space="preserve">Real</w:t>
+                  </w:r>
+                </w:p>
+              </w:tc>
+              <w:tc>
+                <w:tcPr>
+                  <w:tcW w:type="dxa" w:w="1800"/>
+                  <w:tcBorders>
+                    <w:top w:val="none" w:color="FFFFFF" w:sz="0"/>
+                    <w:left w:val="none" w:color="FFFFFF" w:sz="0"/>
+                    <w:bottom w:val="none" w:color="FFFFFF" w:sz="0"/>
+                    <w:right w:val="none" w:color="FFFFFF" w:sz="0"/>
+                  </w:tcBorders>
+                  <w:shd w:fill="14284B" w:color="auto" w:val="clear"/>
+                  <w:tcMar>
+                    <w:top w:type="dxa" w:w="35"/>
+                    <w:left w:type="dxa" w:w="80"/>
+                    <w:bottom w:type="dxa" w:w="35"/>
+                    <w:right w:type="dxa" w:w="80"/>
+                  </w:tcMar>
+                </w:tcPr>
+                <w:p>
+                  <w:pPr>
+                    <w:jc w:val="right"/>
+                  </w:pPr>
+                  <w:r>
+                    <w:rPr>
+                      <w:rFonts w:ascii="Arial" w:cs="Arial" w:eastAsia="Arial" w:hAnsi="Arial"/>
+                      <w:b/>
+                      <w:bCs/>
+                      <w:color w:val="FFFFFF"/>
+                      <w:sz w:val="13"/>
+                      <w:szCs w:val="13"/>
+                    </w:rPr>
+                    <w:t xml:space="preserve">Cost of cap. nom./real</w:t>
+                  </w:r>
+                </w:p>
+              </w:tc>
+              <w:tc>
+                <w:tcPr>
+                  <w:tcW w:type="dxa" w:w="1420"/>
+                  <w:tcBorders>
+                    <w:top w:val="none" w:color="FFFFFF" w:sz="0"/>
+                    <w:left w:val="none" w:color="FFFFFF" w:sz="0"/>
+                    <w:bottom w:val="none" w:color="FFFFFF" w:sz="0"/>
+                    <w:right w:val="none" w:color="FFFFFF" w:sz="0"/>
+                  </w:tcBorders>
+                  <w:shd w:fill="14284B" w:color="auto" w:val="clear"/>
+                  <w:tcMar>
+                    <w:top w:type="dxa" w:w="35"/>
+                    <w:left w:type="dxa" w:w="80"/>
+                    <w:bottom w:type="dxa" w:w="35"/>
+                    <w:right w:type="dxa" w:w="80"/>
+                  </w:tcMar>
+                </w:tcPr>
+                <w:p>
+                  <w:pPr>
+                    <w:jc w:val="right"/>
+                  </w:pPr>
+                  <w:r>
+                    <w:rPr>
+                      <w:rFonts w:ascii="Arial" w:cs="Arial" w:eastAsia="Arial" w:hAnsi="Arial"/>
+                      <w:b/>
+                      <w:bCs/>
+                      <w:color w:val="FFFFFF"/>
+                      <w:sz w:val="13"/>
+                      <w:szCs w:val="13"/>
+                    </w:rPr>
+                    <w:t xml:space="preserve">Gap nom./real</w:t>
+                  </w:r>
+                </w:p>
+              </w:tc>
+            </w:tr>
+            <w:tr>
+              <w:tc>
+                <w:tcPr>
+                  <w:tcW w:type="dxa" w:w="2300"/>
+                  <w:tcBorders>
+                    <w:top w:val="none" w:color="FFFFFF" w:sz="0"/>
+                    <w:left w:val="none" w:color="FFFFFF" w:sz="0"/>
+                    <w:bottom w:val="single" w:color="D5D9E0" w:sz="4"/>
+                    <w:right w:val="none" w:color="FFFFFF" w:sz="0"/>
+                  </w:tcBorders>
+                  <w:shd w:fill="FDF1CC" w:color="auto" w:val="clear"/>
+                  <w:tcMar>
+                    <w:top w:type="dxa" w:w="25"/>
+                    <w:left w:type="dxa" w:w="80"/>
+                    <w:bottom w:type="dxa" w:w="25"/>
+                    <w:right w:type="dxa" w:w="80"/>
+                  </w:tcMar>
+                  <w:vAlign w:val="center"/>
+                </w:tcPr>
+                <w:p>
+                  <w:pPr>
+                    <w:spacing w:line="216" w:lineRule="auto"/>
+                    <w:jc w:val="left"/>
+                  </w:pPr>
+                  <w:r>
+                    <w:rPr>
+                      <w:rFonts w:ascii="Arial" w:cs="Arial" w:eastAsia="Arial" w:hAnsi="Arial"/>
+                      <w:b/>
+                      <w:bCs/>
+                      <w:color w:val="1A1A1A"/>
+                      <w:sz w:val="13"/>
+                      <w:szCs w:val="13"/>
+                      <w:shd w:fill="ECB100" w:color="auto" w:val="clear"/>
+                    </w:rPr>
+                    <w:t xml:space="preserve">Firm (FCFF), single rate</w:t>
+                  </w:r>
+                </w:p>
+              </w:tc>
+              <w:tc>
+                <w:tcPr>
+                  <w:tcW w:type="dxa" w:w="740"/>
+                  <w:tcBorders>
+                    <w:top w:val="none" w:color="FFFFFF" w:sz="0"/>
+                    <w:left w:val="none" w:color="FFFFFF" w:sz="0"/>
+                    <w:bottom w:val="single" w:color="D5D9E0" w:sz="4"/>
+                    <w:right w:val="none" w:color="FFFFFF" w:sz="0"/>
+                  </w:tcBorders>
+                  <w:shd w:fill="FDF1CC" w:color="auto" w:val="clear"/>
+                  <w:tcMar>
+                    <w:top w:type="dxa" w:w="25"/>
+                    <w:left w:type="dxa" w:w="80"/>
+                    <w:bottom w:type="dxa" w:w="25"/>
+                    <w:right w:type="dxa" w:w="80"/>
+                  </w:tcMar>
+                  <w:vAlign w:val="center"/>
+                </w:tcPr>
+                <w:p>
+                  <w:pPr>
+                    <w:spacing w:line="216" w:lineRule="auto"/>
+                    <w:jc w:val="right"/>
+                  </w:pPr>
+                  <w:r>
+                    <w:rPr>
+                      <w:rFonts w:ascii="Arial" w:cs="Arial" w:eastAsia="Arial" w:hAnsi="Arial"/>
+                      <w:b/>
+                      <w:bCs/>
+                      <w:color w:val="1A1A1A"/>
+                      <w:sz w:val="13"/>
+                      <w:szCs w:val="13"/>
+                      <w:shd w:fill="ECB100" w:color="auto" w:val="clear"/>
+                    </w:rPr>
+                    <w:t xml:space="preserve">7.57%</w:t>
+                  </w:r>
+                </w:p>
+              </w:tc>
+              <w:tc>
+                <w:tcPr>
+                  <w:tcW w:type="dxa" w:w="640"/>
+                  <w:tcBorders>
+                    <w:top w:val="none" w:color="FFFFFF" w:sz="0"/>
+                    <w:left w:val="none" w:color="FFFFFF" w:sz="0"/>
+                    <w:bottom w:val="single" w:color="D5D9E0" w:sz="4"/>
+                    <w:right w:val="none" w:color="FFFFFF" w:sz="0"/>
+                  </w:tcBorders>
+                  <w:shd w:fill="FDF1CC" w:color="auto" w:val="clear"/>
+                  <w:tcMar>
+                    <w:top w:type="dxa" w:w="25"/>
+                    <w:left w:type="dxa" w:w="80"/>
+                    <w:bottom w:type="dxa" w:w="25"/>
+                    <w:right w:type="dxa" w:w="80"/>
+                  </w:tcMar>
+                  <w:vAlign w:val="center"/>
+                </w:tcPr>
+                <w:p>
+                  <w:pPr>
+                    <w:spacing w:line="216" w:lineRule="auto"/>
+                    <w:jc w:val="right"/>
+                  </w:pPr>
+                  <w:r>
+                    <w:rPr>
+                      <w:rFonts w:ascii="Arial" w:cs="Arial" w:eastAsia="Arial" w:hAnsi="Arial"/>
+                      <w:b/>
+                      <w:bCs/>
+                      <w:color w:val="1A1A1A"/>
+                      <w:sz w:val="13"/>
+                      <w:szCs w:val="13"/>
+                      <w:shd w:fill="ECB100" w:color="auto" w:val="clear"/>
+                    </w:rPr>
+                    <w:t xml:space="preserve">4.44%</w:t>
+                  </w:r>
+                </w:p>
+              </w:tc>
+              <w:tc>
+                <w:tcPr>
+                  <w:tcW w:type="dxa" w:w="1800"/>
+                  <w:tcBorders>
+                    <w:top w:val="none" w:color="FFFFFF" w:sz="0"/>
+                    <w:left w:val="none" w:color="FFFFFF" w:sz="0"/>
+                    <w:bottom w:val="single" w:color="D5D9E0" w:sz="4"/>
+                    <w:right w:val="none" w:color="FFFFFF" w:sz="0"/>
+                  </w:tcBorders>
+                  <w:shd w:fill="FDF1CC" w:color="auto" w:val="clear"/>
+                  <w:tcMar>
+                    <w:top w:type="dxa" w:w="25"/>
+                    <w:left w:type="dxa" w:w="80"/>
+                    <w:bottom w:type="dxa" w:w="25"/>
+                    <w:right w:type="dxa" w:w="80"/>
+                  </w:tcMar>
+                  <w:vAlign w:val="center"/>
+                </w:tcPr>
+                <w:p>
+                  <w:pPr>
+                    <w:spacing w:line="216" w:lineRule="auto"/>
+                    <w:jc w:val="right"/>
+                  </w:pPr>
+                  <w:r>
+                    <w:rPr>
+                      <w:rFonts w:ascii="Arial" w:cs="Arial" w:eastAsia="Arial" w:hAnsi="Arial"/>
+                      <w:b/>
+                      <w:bCs/>
+                      <w:color w:val="1A1A1A"/>
+                      <w:sz w:val="13"/>
+                      <w:szCs w:val="13"/>
+                      <w:shd w:fill="ECB100" w:color="auto" w:val="clear"/>
+                    </w:rPr>
+                    <w:t xml:space="preserve">WACC 10.41% / 7.20%</w:t>
+                  </w:r>
+                </w:p>
+              </w:tc>
+              <w:tc>
+                <w:tcPr>
+                  <w:tcW w:type="dxa" w:w="1420"/>
+                  <w:tcBorders>
+                    <w:top w:val="none" w:color="FFFFFF" w:sz="0"/>
+                    <w:left w:val="none" w:color="FFFFFF" w:sz="0"/>
+                    <w:bottom w:val="single" w:color="D5D9E0" w:sz="4"/>
+                    <w:right w:val="none" w:color="FFFFFF" w:sz="0"/>
+                  </w:tcBorders>
+                  <w:shd w:fill="FDF1CC" w:color="auto" w:val="clear"/>
+                  <w:tcMar>
+                    <w:top w:type="dxa" w:w="25"/>
+                    <w:left w:type="dxa" w:w="80"/>
+                    <w:bottom w:type="dxa" w:w="25"/>
+                    <w:right w:type="dxa" w:w="80"/>
+                  </w:tcMar>
+                  <w:vAlign w:val="center"/>
+                </w:tcPr>
+                <w:p>
+                  <w:pPr>
+                    <w:spacing w:line="216" w:lineRule="auto"/>
+                    <w:jc w:val="right"/>
+                  </w:pPr>
+                  <w:r>
+                    <w:rPr>
+                      <w:rFonts w:ascii="Arial" w:cs="Arial" w:eastAsia="Arial" w:hAnsi="Arial"/>
+                      <w:b/>
+                      <w:bCs/>
+                      <w:color w:val="1A1A1A"/>
+                      <w:sz w:val="13"/>
+                      <w:szCs w:val="13"/>
+                      <w:shd w:fill="ECB100" w:color="auto" w:val="clear"/>
+                    </w:rPr>
+                    <w:t xml:space="preserve">−284 / −276 bp</w:t>
+                  </w:r>
+                </w:p>
+              </w:tc>
+            </w:tr>
+            <w:tr>
+              <w:tc>
+                <w:tcPr>
+                  <w:tcW w:type="dxa" w:w="2300"/>
+                  <w:tcBorders>
+                    <w:top w:val="none" w:color="FFFFFF" w:sz="0"/>
+                    <w:left w:val="none" w:color="FFFFFF" w:sz="0"/>
+                    <w:bottom w:val="single" w:color="D5D9E0" w:sz="4"/>
+                    <w:right w:val="none" w:color="FFFFFF" w:sz="0"/>
+                  </w:tcBorders>
+                  <w:shd w:fill="FFFFFF" w:color="auto" w:val="clear"/>
+                  <w:tcMar>
+                    <w:top w:type="dxa" w:w="25"/>
+                    <w:left w:type="dxa" w:w="80"/>
+                    <w:bottom w:type="dxa" w:w="25"/>
+                    <w:right w:type="dxa" w:w="80"/>
+                  </w:tcMar>
+                  <w:vAlign w:val="center"/>
+                </w:tcPr>
+                <w:p>
+                  <w:pPr>
+                    <w:spacing w:line="216" w:lineRule="auto"/>
+                    <w:jc w:val="left"/>
+                  </w:pPr>
+                  <w:r>
+                    <w:rPr>
+                      <w:rFonts w:ascii="Arial" w:cs="Arial" w:eastAsia="Arial" w:hAnsi="Arial"/>
+                      <w:b w:val="false"/>
+                      <w:bCs w:val="false"/>
+                      <w:color w:val="1A1A1A"/>
+                      <w:sz w:val="13"/>
+                      <w:szCs w:val="13"/>
+                      <w:shd w:fill="ECB100" w:color="auto" w:val="clear"/>
+                    </w:rPr>
+                    <w:t xml:space="preserve">Shareholder, exits at our value</w:t>
+                  </w:r>
+                </w:p>
+              </w:tc>
+              <w:tc>
+                <w:tcPr>
+                  <w:tcW w:type="dxa" w:w="740"/>
+                  <w:tcBorders>
+                    <w:top w:val="none" w:color="FFFFFF" w:sz="0"/>
+                    <w:left w:val="none" w:color="FFFFFF" w:sz="0"/>
+                    <w:bottom w:val="single" w:color="D5D9E0" w:sz="4"/>
+                    <w:right w:val="none" w:color="FFFFFF" w:sz="0"/>
+                  </w:tcBorders>
+                  <w:shd w:fill="FFFFFF" w:color="auto" w:val="clear"/>
+                  <w:tcMar>
+                    <w:top w:type="dxa" w:w="25"/>
+                    <w:left w:type="dxa" w:w="80"/>
+                    <w:bottom w:type="dxa" w:w="25"/>
+                    <w:right w:type="dxa" w:w="80"/>
+                  </w:tcMar>
+                  <w:vAlign w:val="center"/>
+                </w:tcPr>
+                <w:p>
+                  <w:pPr>
+                    <w:spacing w:line="216" w:lineRule="auto"/>
+                    <w:jc w:val="right"/>
+                  </w:pPr>
+                  <w:r>
+                    <w:rPr>
+                      <w:rFonts w:ascii="Arial" w:cs="Arial" w:eastAsia="Arial" w:hAnsi="Arial"/>
+                      <w:b w:val="false"/>
+                      <w:bCs w:val="false"/>
+                      <w:color w:val="1A1A1A"/>
+                      <w:sz w:val="13"/>
+                      <w:szCs w:val="13"/>
+                      <w:shd w:fill="ECB100" w:color="auto" w:val="clear"/>
+                    </w:rPr>
+                    <w:t xml:space="preserve">−2.0%</w:t>
+                  </w:r>
+                </w:p>
+              </w:tc>
+              <w:tc>
+                <w:tcPr>
+                  <w:tcW w:type="dxa" w:w="640"/>
+                  <w:tcBorders>
+                    <w:top w:val="none" w:color="FFFFFF" w:sz="0"/>
+                    <w:left w:val="none" w:color="FFFFFF" w:sz="0"/>
+                    <w:bottom w:val="single" w:color="D5D9E0" w:sz="4"/>
+                    <w:right w:val="none" w:color="FFFFFF" w:sz="0"/>
+                  </w:tcBorders>
+                  <w:shd w:fill="FFFFFF" w:color="auto" w:val="clear"/>
+                  <w:tcMar>
+                    <w:top w:type="dxa" w:w="25"/>
+                    <w:left w:type="dxa" w:w="80"/>
+                    <w:bottom w:type="dxa" w:w="25"/>
+                    <w:right w:type="dxa" w:w="80"/>
+                  </w:tcMar>
+                  <w:vAlign w:val="center"/>
+                </w:tcPr>
+                <w:p>
+                  <w:pPr>
+                    <w:spacing w:line="216" w:lineRule="auto"/>
+                    <w:jc w:val="right"/>
+                  </w:pPr>
+                  <w:r>
+                    <w:rPr>
+                      <w:rFonts w:ascii="Arial" w:cs="Arial" w:eastAsia="Arial" w:hAnsi="Arial"/>
+                      <w:b w:val="false"/>
+                      <w:bCs w:val="false"/>
+                      <w:color w:val="1A1A1A"/>
+                      <w:sz w:val="13"/>
+                      <w:szCs w:val="13"/>
+                      <w:shd w:fill="ECB100" w:color="auto" w:val="clear"/>
+                    </w:rPr>
+                    <w:t xml:space="preserve">−4.9%</w:t>
+                  </w:r>
+                </w:p>
+              </w:tc>
+              <w:tc>
+                <w:tcPr>
+                  <w:tcW w:type="dxa" w:w="1800"/>
+                  <w:tcBorders>
+                    <w:top w:val="none" w:color="FFFFFF" w:sz="0"/>
+                    <w:left w:val="none" w:color="FFFFFF" w:sz="0"/>
+                    <w:bottom w:val="single" w:color="D5D9E0" w:sz="4"/>
+                    <w:right w:val="none" w:color="FFFFFF" w:sz="0"/>
+                  </w:tcBorders>
+                  <w:shd w:fill="FFFFFF" w:color="auto" w:val="clear"/>
+                  <w:tcMar>
+                    <w:top w:type="dxa" w:w="25"/>
+                    <w:left w:type="dxa" w:w="80"/>
+                    <w:bottom w:type="dxa" w:w="25"/>
+                    <w:right w:type="dxa" w:w="80"/>
+                  </w:tcMar>
+                  <w:vAlign w:val="center"/>
+                </w:tcPr>
+                <w:p>
+                  <w:pPr>
+                    <w:spacing w:line="216" w:lineRule="auto"/>
+                    <w:jc w:val="right"/>
+                  </w:pPr>
+                  <w:r>
+                    <w:rPr>
+                      <w:rFonts w:ascii="Arial" w:cs="Arial" w:eastAsia="Arial" w:hAnsi="Arial"/>
+                      <w:b w:val="false"/>
+                      <w:bCs w:val="false"/>
+                      <w:color w:val="1A1A1A"/>
+                      <w:sz w:val="13"/>
+                      <w:szCs w:val="13"/>
+                      <w:shd w:fill="ECB100" w:color="auto" w:val="clear"/>
+                    </w:rPr>
+                    <w:t xml:space="preserve">Ke 11.93% / 8.67%</w:t>
+                  </w:r>
+                </w:p>
+              </w:tc>
+              <w:tc>
+                <w:tcPr>
+                  <w:tcW w:type="dxa" w:w="1420"/>
+                  <w:tcBorders>
+                    <w:top w:val="none" w:color="FFFFFF" w:sz="0"/>
+                    <w:left w:val="none" w:color="FFFFFF" w:sz="0"/>
+                    <w:bottom w:val="single" w:color="D5D9E0" w:sz="4"/>
+                    <w:right w:val="none" w:color="FFFFFF" w:sz="0"/>
+                  </w:tcBorders>
+                  <w:shd w:fill="FFFFFF" w:color="auto" w:val="clear"/>
+                  <w:tcMar>
+                    <w:top w:type="dxa" w:w="25"/>
+                    <w:left w:type="dxa" w:w="80"/>
+                    <w:bottom w:type="dxa" w:w="25"/>
+                    <w:right w:type="dxa" w:w="80"/>
+                  </w:tcMar>
+                  <w:vAlign w:val="center"/>
+                </w:tcPr>
+                <w:p>
+                  <w:pPr>
+                    <w:spacing w:line="216" w:lineRule="auto"/>
+                    <w:jc w:val="right"/>
+                  </w:pPr>
+                  <w:r>
+                    <w:rPr>
+                      <w:rFonts w:ascii="Arial" w:cs="Arial" w:eastAsia="Arial" w:hAnsi="Arial"/>
+                      <w:b w:val="false"/>
+                      <w:bCs w:val="false"/>
+                      <w:color w:val="1A1A1A"/>
+                      <w:sz w:val="13"/>
+                      <w:szCs w:val="13"/>
+                      <w:shd w:fill="ECB100" w:color="auto" w:val="clear"/>
+                    </w:rPr>
+                    <w:t xml:space="preserve">−1,395 / −1,354 bp</w:t>
+                  </w:r>
+                </w:p>
+              </w:tc>
+            </w:tr>
+            <w:tr>
+              <w:tc>
+                <w:tcPr>
+                  <w:tcW w:type="dxa" w:w="2300"/>
+                  <w:tcBorders>
+                    <w:top w:val="none" w:color="FFFFFF" w:sz="0"/>
+                    <w:left w:val="none" w:color="FFFFFF" w:sz="0"/>
+                    <w:bottom w:val="single" w:color="D5D9E0" w:sz="4"/>
+                    <w:right w:val="none" w:color="FFFFFF" w:sz="0"/>
+                  </w:tcBorders>
+                  <w:shd w:fill="F7F8FB" w:color="auto" w:val="clear"/>
+                  <w:tcMar>
+                    <w:top w:type="dxa" w:w="25"/>
+                    <w:left w:type="dxa" w:w="80"/>
+                    <w:bottom w:type="dxa" w:w="25"/>
+                    <w:right w:type="dxa" w:w="80"/>
+                  </w:tcMar>
+                  <w:vAlign w:val="center"/>
+                </w:tcPr>
+                <w:p>
+                  <w:pPr>
+                    <w:spacing w:line="216" w:lineRule="auto"/>
+                    <w:jc w:val="left"/>
+                  </w:pPr>
+                  <w:r>
+                    <w:rPr>
+                      <w:rFonts w:ascii="Arial" w:cs="Arial" w:eastAsia="Arial" w:hAnsi="Arial"/>
+                      <w:b w:val="false"/>
+                      <w:bCs w:val="false"/>
+                      <w:color w:val="1A1A1A"/>
+                      <w:sz w:val="13"/>
+                      <w:szCs w:val="13"/>
+                      <w:shd w:fill="ECB100" w:color="auto" w:val="clear"/>
+                    </w:rPr>
+                    <w:t xml:space="preserve">Shareholder, buys at target</w:t>
+                  </w:r>
+                </w:p>
+              </w:tc>
+              <w:tc>
+                <w:tcPr>
+                  <w:tcW w:type="dxa" w:w="740"/>
+                  <w:tcBorders>
+                    <w:top w:val="none" w:color="FFFFFF" w:sz="0"/>
+                    <w:left w:val="none" w:color="FFFFFF" w:sz="0"/>
+                    <w:bottom w:val="single" w:color="D5D9E0" w:sz="4"/>
+                    <w:right w:val="none" w:color="FFFFFF" w:sz="0"/>
+                  </w:tcBorders>
+                  <w:shd w:fill="F7F8FB" w:color="auto" w:val="clear"/>
+                  <w:tcMar>
+                    <w:top w:type="dxa" w:w="25"/>
+                    <w:left w:type="dxa" w:w="80"/>
+                    <w:bottom w:type="dxa" w:w="25"/>
+                    <w:right w:type="dxa" w:w="80"/>
+                  </w:tcMar>
+                  <w:vAlign w:val="center"/>
+                </w:tcPr>
+                <w:p>
+                  <w:pPr>
+                    <w:spacing w:line="216" w:lineRule="auto"/>
+                    <w:jc w:val="right"/>
+                  </w:pPr>
+                  <w:r>
+                    <w:rPr>
+                      <w:rFonts w:ascii="Arial" w:cs="Arial" w:eastAsia="Arial" w:hAnsi="Arial"/>
+                      <w:b w:val="false"/>
+                      <w:bCs w:val="false"/>
+                      <w:color w:val="1A1A1A"/>
+                      <w:sz w:val="13"/>
+                      <w:szCs w:val="13"/>
+                      <w:shd w:fill="ECB100" w:color="auto" w:val="clear"/>
+                    </w:rPr>
+                    <w:t xml:space="preserve">10.6%</w:t>
+                  </w:r>
+                </w:p>
+              </w:tc>
+              <w:tc>
+                <w:tcPr>
+                  <w:tcW w:type="dxa" w:w="640"/>
+                  <w:tcBorders>
+                    <w:top w:val="none" w:color="FFFFFF" w:sz="0"/>
+                    <w:left w:val="none" w:color="FFFFFF" w:sz="0"/>
+                    <w:bottom w:val="single" w:color="D5D9E0" w:sz="4"/>
+                    <w:right w:val="none" w:color="FFFFFF" w:sz="0"/>
+                  </w:tcBorders>
+                  <w:shd w:fill="F7F8FB" w:color="auto" w:val="clear"/>
+                  <w:tcMar>
+                    <w:top w:type="dxa" w:w="25"/>
+                    <w:left w:type="dxa" w:w="80"/>
+                    <w:bottom w:type="dxa" w:w="25"/>
+                    <w:right w:type="dxa" w:w="80"/>
+                  </w:tcMar>
+                  <w:vAlign w:val="center"/>
+                </w:tcPr>
+                <w:p>
+                  <w:pPr>
+                    <w:spacing w:line="216" w:lineRule="auto"/>
+                    <w:jc w:val="right"/>
+                  </w:pPr>
+                  <w:r>
+                    <w:rPr>
+                      <w:rFonts w:ascii="Arial" w:cs="Arial" w:eastAsia="Arial" w:hAnsi="Arial"/>
+                      <w:b w:val="false"/>
+                      <w:bCs w:val="false"/>
+                      <w:color w:val="1A1A1A"/>
+                      <w:sz w:val="13"/>
+                      <w:szCs w:val="13"/>
+                      <w:shd w:fill="ECB100" w:color="auto" w:val="clear"/>
+                    </w:rPr>
+                    <w:t xml:space="preserve">7.4%</w:t>
+                  </w:r>
+                </w:p>
+              </w:tc>
+              <w:tc>
+                <w:tcPr>
+                  <w:tcW w:type="dxa" w:w="1800"/>
+                  <w:tcBorders>
+                    <w:top w:val="none" w:color="FFFFFF" w:sz="0"/>
+                    <w:left w:val="none" w:color="FFFFFF" w:sz="0"/>
+                    <w:bottom w:val="single" w:color="D5D9E0" w:sz="4"/>
+                    <w:right w:val="none" w:color="FFFFFF" w:sz="0"/>
+                  </w:tcBorders>
+                  <w:shd w:fill="F7F8FB" w:color="auto" w:val="clear"/>
+                  <w:tcMar>
+                    <w:top w:type="dxa" w:w="25"/>
+                    <w:left w:type="dxa" w:w="80"/>
+                    <w:bottom w:type="dxa" w:w="25"/>
+                    <w:right w:type="dxa" w:w="80"/>
+                  </w:tcMar>
+                  <w:vAlign w:val="center"/>
+                </w:tcPr>
+                <w:p>
+                  <w:pPr>
+                    <w:spacing w:line="216" w:lineRule="auto"/>
+                    <w:jc w:val="right"/>
+                  </w:pPr>
+                  <w:r>
+                    <w:rPr>
+                      <w:rFonts w:ascii="Arial" w:cs="Arial" w:eastAsia="Arial" w:hAnsi="Arial"/>
+                      <w:b w:val="false"/>
+                      <w:bCs w:val="false"/>
+                      <w:color w:val="1A1A1A"/>
+                      <w:sz w:val="13"/>
+                      <w:szCs w:val="13"/>
+                      <w:shd w:fill="ECB100" w:color="auto" w:val="clear"/>
+                    </w:rPr>
+                    <w:t xml:space="preserve">Ke 11.93% / 8.67%</w:t>
+                  </w:r>
+                </w:p>
+              </w:tc>
+              <w:tc>
+                <w:tcPr>
+                  <w:tcW w:type="dxa" w:w="1420"/>
+                  <w:tcBorders>
+                    <w:top w:val="none" w:color="FFFFFF" w:sz="0"/>
+                    <w:left w:val="none" w:color="FFFFFF" w:sz="0"/>
+                    <w:bottom w:val="single" w:color="D5D9E0" w:sz="4"/>
+                    <w:right w:val="none" w:color="FFFFFF" w:sz="0"/>
+                  </w:tcBorders>
+                  <w:shd w:fill="F7F8FB" w:color="auto" w:val="clear"/>
+                  <w:tcMar>
+                    <w:top w:type="dxa" w:w="25"/>
+                    <w:left w:type="dxa" w:w="80"/>
+                    <w:bottom w:type="dxa" w:w="25"/>
+                    <w:right w:type="dxa" w:w="80"/>
+                  </w:tcMar>
+                  <w:vAlign w:val="center"/>
+                </w:tcPr>
+                <w:p>
+                  <w:pPr>
+                    <w:spacing w:line="216" w:lineRule="auto"/>
+                    <w:jc w:val="right"/>
+                  </w:pPr>
+                  <w:r>
+                    <w:rPr>
+                      <w:rFonts w:ascii="Arial" w:cs="Arial" w:eastAsia="Arial" w:hAnsi="Arial"/>
+                      <w:b w:val="false"/>
+                      <w:bCs w:val="false"/>
+                      <w:color w:val="1A1A1A"/>
+                      <w:sz w:val="13"/>
+                      <w:szCs w:val="13"/>
+                      <w:shd w:fill="ECB100" w:color="auto" w:val="clear"/>
+                    </w:rPr>
+                    <w:t xml:space="preserve">−135 / −131 bp</w:t>
+                  </w:r>
+                </w:p>
+              </w:tc>
+            </w:tr>
+          </w:tbl>
+          <w:p>
+            <w:pPr>
+              <w:spacing w:after="60" w:before="20" w:line="216" w:lineRule="auto"/>
+              <w:jc w:val="both"/>
+            </w:pPr>
+            <w:r>
+              <w:rPr>
+                <w:rFonts w:ascii="Arial" w:cs="Arial" w:eastAsia="Arial" w:hAnsi="Arial"/>
+                <w:color w:val="5F5F5F"/>
+                <w:sz w:val="11"/>
+                <w:szCs w:val="11"/>
+                <w:shd w:fill="ECB100" w:color="auto" w:val="clear"/>
+              </w:rPr>
+              <w:t xml:space="preserve">IRR: the rate that equates the value of the cash flows to the price. Firm: a single rate on FCFF and terminal value (Figure 34 shifts the whole WACC curve and gives 7.56%; both give CLP 3,555). Shareholder: the model's distributions (with the extra one that takes net debt/EBITDA to 3.5x) and exit at 31-Dec-31 at our value. Real = (1 + nom.) / (1 + 3.0%) − 1. Source: model v3, TIR_Accionista sheet.</w:t>
             </w:r>
           </w:p>
           <w:p>
@@ -245,11 +1255,51 @@
             <w:r>
               <w:rPr>
                 <w:rFonts w:ascii="Arial" w:cs="Arial" w:eastAsia="Arial" w:hAnsi="Arial"/>
-                <w:color w:val="1A1A1A"/>
-                <w:sz w:val="16"/>
-                <w:szCs w:val="16"/>
-              </w:rPr>
-              <w:t xml:space="preserve">Capex follows the company's plan: the pipeline and maintenance (5.5% of revenue) take base capex to a peak of CLP 240,660 million in 2027, and continuous expansion adds CLP 95,000–104,000 million a year from 2028, at the cost of the identified pipeline (USD 3,603 per m²) with a 35%, 90% and 100% revenue ramp. Working capital, at 15.6% of revenue, requires only CLP 7,100–9,900 million a year and moves the price by ±1.2% (Figure 29). These are assumptions the team can defend line by line (Appendix [C]).</w:t>
+                <w:b/>
+                <w:bCs/>
+                <w:color w:val="1A1A1A"/>
+                <w:sz w:val="12"/>
+                <w:szCs w:val="12"/>
+                <w:shd w:fill="ECB100" w:color="auto" w:val="clear"/>
+              </w:rPr>
+              <w:t xml:space="preserve">NEW</w:t>
+            </w:r>
+            <w:r>
+              <w:rPr>
+                <w:rFonts w:ascii="Arial" w:cs="Arial" w:eastAsia="Arial" w:hAnsi="Arial"/>
+                <w:color w:val="1A1A1A"/>
+                <w:sz w:val="16"/>
+                <w:szCs w:val="16"/>
+              </w:rPr>
+              <w:t xml:space="preserve"> </w:t>
+            </w:r>
+            <w:r>
+              <w:rPr>
+                <w:rFonts w:ascii="Arial" w:cs="Arial" w:eastAsia="Arial" w:hAnsi="Arial"/>
+                <w:color w:val="1A1A1A"/>
+                <w:sz w:val="16"/>
+                <w:szCs w:val="16"/>
+              </w:rPr>
+              <w:t xml:space="preserve">Capex follows the company's plan: the pipeline and maintenance (5.5% of revenue) take base capex to a peak of CLP 240,660 million in 2027, and continuous expansion adds CLP 95,000–104,000 million a year from 2028, at the cost of the identified pipeline (USD 3,603 per m²) with a 35%, 90% and 100% revenue ramp. Working capital, at 15.6% of revenue, requires only CLP 7,100–9,900 million a year and moves the price by ±1.2% (Figure 29</w:t>
+            </w:r>
+            <w:r>
+              <w:rPr>
+                <w:rFonts w:ascii="Arial" w:cs="Arial" w:eastAsia="Arial" w:hAnsi="Arial"/>
+                <w:color w:val="1A1A1A"/>
+                <w:sz w:val="16"/>
+                <w:szCs w:val="16"/>
+                <w:shd w:fill="ECB100" w:color="auto" w:val="clear"/>
+              </w:rPr>
+              <w:t xml:space="preserve">; Appendix [C]</w:t>
+            </w:r>
+            <w:r>
+              <w:rPr>
+                <w:rFonts w:ascii="Arial" w:cs="Arial" w:eastAsia="Arial" w:hAnsi="Arial"/>
+                <w:color w:val="1A1A1A"/>
+                <w:sz w:val="16"/>
+                <w:szCs w:val="16"/>
+              </w:rPr>
+              <w:t xml:space="preserve">).</w:t>
             </w:r>
           </w:p>
           <w:p>
@@ -275,11 +1325,51 @@
             <w:r>
               <w:rPr>
                 <w:rFonts w:ascii="Arial" w:cs="Arial" w:eastAsia="Arial" w:hAnsi="Arial"/>
-                <w:color w:val="1A1A1A"/>
-                <w:sz w:val="16"/>
-                <w:szCs w:val="16"/>
-              </w:rPr>
-              <w:t xml:space="preserve">The problem is the return on growth. Each new m² yields 6.9% on cost, a 5.0% real RONIC after tax, below a 7.2% real WACC. Expansion adds revenue but not value, so terminal value grows only with inflation (g of 3.0% nominal, 0% real) and a higher g lowers value (Figure 30). Assuming more growth would not close the gap with the price; it would widen it.</w:t>
+                <w:b/>
+                <w:bCs/>
+                <w:color w:val="1A1A1A"/>
+                <w:sz w:val="12"/>
+                <w:szCs w:val="12"/>
+                <w:shd w:fill="ECB100" w:color="auto" w:val="clear"/>
+              </w:rPr>
+              <w:t xml:space="preserve">NEW</w:t>
+            </w:r>
+            <w:r>
+              <w:rPr>
+                <w:rFonts w:ascii="Arial" w:cs="Arial" w:eastAsia="Arial" w:hAnsi="Arial"/>
+                <w:color w:val="1A1A1A"/>
+                <w:sz w:val="16"/>
+                <w:szCs w:val="16"/>
+              </w:rPr>
+              <w:t xml:space="preserve"> </w:t>
+            </w:r>
+            <w:r>
+              <w:rPr>
+                <w:rFonts w:ascii="Arial" w:cs="Arial" w:eastAsia="Arial" w:hAnsi="Arial"/>
+                <w:color w:val="1A1A1A"/>
+                <w:sz w:val="16"/>
+                <w:szCs w:val="16"/>
+              </w:rPr>
+              <w:t xml:space="preserve">The problem is the return on growth. Each new m² yields </w:t>
+            </w:r>
+            <w:r>
+              <w:rPr>
+                <w:rFonts w:ascii="Arial" w:cs="Arial" w:eastAsia="Arial" w:hAnsi="Arial"/>
+                <w:color w:val="1A1A1A"/>
+                <w:sz w:val="16"/>
+                <w:szCs w:val="16"/>
+                <w:shd w:fill="ECB100" w:color="auto" w:val="clear"/>
+              </w:rPr>
+              <w:t xml:space="preserve">6.9% real pre-tax</w:t>
+            </w:r>
+            <w:r>
+              <w:rPr>
+                <w:rFonts w:ascii="Arial" w:cs="Arial" w:eastAsia="Arial" w:hAnsi="Arial"/>
+                <w:color w:val="1A1A1A"/>
+                <w:sz w:val="16"/>
+                <w:szCs w:val="16"/>
+              </w:rPr>
+              <w:t xml:space="preserve"> on cost, a 5.0% real RONIC after tax, below a 7.2% real WACC. Expansion adds revenue but not value, so terminal value grows only with inflation (g of 3.0% nominal, 0% real) and a higher g lowers value (Figure 30). Assuming more growth would not close the gap with the price; it would widen it.</w:t>
             </w:r>
           </w:p>
           <w:p>
@@ -290,11 +1380,42 @@
             <w:r>
               <w:rPr>
                 <w:rFonts w:ascii="Arial" w:cs="Arial" w:eastAsia="Arial" w:hAnsi="Arial"/>
-                <w:color w:val="1A1A1A"/>
-                <w:sz w:val="16"/>
-                <w:szCs w:val="16"/>
-              </w:rPr>
-              <w:t xml:space="preserve">That is why the explicit horizon includes the capex and ramp-up of projects opening through 2032 (108,301 m² of mature GLA in the terminal year), but from then on the model adds no new malls: terminal capex covers maintenance only (5.5% of revenue). This is not a conservative assumption against the company; at these returns, growing more would reduce its value.</w:t>
+                <w:b/>
+                <w:bCs/>
+                <w:color w:val="1A1A1A"/>
+                <w:sz w:val="12"/>
+                <w:szCs w:val="12"/>
+                <w:shd w:fill="ECB100" w:color="auto" w:val="clear"/>
+              </w:rPr>
+              <w:t xml:space="preserve">NEW</w:t>
+            </w:r>
+            <w:r>
+              <w:rPr>
+                <w:rFonts w:ascii="Arial" w:cs="Arial" w:eastAsia="Arial" w:hAnsi="Arial"/>
+                <w:color w:val="1A1A1A"/>
+                <w:sz w:val="16"/>
+                <w:szCs w:val="16"/>
+              </w:rPr>
+              <w:t xml:space="preserve"> </w:t>
+            </w:r>
+            <w:r>
+              <w:rPr>
+                <w:rFonts w:ascii="Arial" w:cs="Arial" w:eastAsia="Arial" w:hAnsi="Arial"/>
+                <w:color w:val="1A1A1A"/>
+                <w:sz w:val="16"/>
+                <w:szCs w:val="16"/>
+              </w:rPr>
+              <w:t xml:space="preserve">That is why the explicit horizon includes the capex and ramp-up of projects opening through 2032 (108,301 m² of mature GLA in the terminal year), but from then on the model adds no new malls: terminal capex covers maintenance only (5.5% of revenue). </w:t>
+            </w:r>
+            <w:r>
+              <w:rPr>
+                <w:rFonts w:ascii="Arial" w:cs="Arial" w:eastAsia="Arial" w:hAnsi="Arial"/>
+                <w:color w:val="1A1A1A"/>
+                <w:sz w:val="16"/>
+                <w:szCs w:val="16"/>
+                <w:shd w:fill="ECB100" w:color="auto" w:val="clear"/>
+              </w:rPr>
+              <w:t xml:space="preserve">At these returns, growing more would reduce its value.</w:t>
             </w:r>
           </w:p>
         </w:tc>
@@ -436,11 +1557,33 @@
             <w:r>
               <w:rPr>
                 <w:rFonts w:ascii="Arial" w:cs="Arial" w:eastAsia="Arial" w:hAnsi="Arial"/>
+                <w:b/>
+                <w:bCs/>
+                <w:color w:val="14284B"/>
+                <w:sz w:val="12"/>
+                <w:szCs w:val="12"/>
+                <w:shd w:fill="ECB100" w:color="auto" w:val="clear"/>
+              </w:rPr>
+              <w:t xml:space="preserve">NEW</w:t>
+            </w:r>
+            <w:r>
+              <w:rPr>
+                <w:rFonts w:ascii="Arial" w:cs="Arial" w:eastAsia="Arial" w:hAnsi="Arial"/>
                 <w:color w:val="14284B"/>
                 <w:sz w:val="14"/>
                 <w:szCs w:val="14"/>
               </w:rPr>
-              <w:t xml:space="preserve">At CLP 3,555 equity yields almost the same as debt</w:t>
+              <w:t xml:space="preserve"> </w:t>
+            </w:r>
+            <w:r>
+              <w:rPr>
+                <w:rFonts w:ascii="Arial" w:cs="Arial" w:eastAsia="Arial" w:hAnsi="Arial"/>
+                <w:color w:val="14284B"/>
+                <w:sz w:val="14"/>
+                <w:szCs w:val="14"/>
+                <w:shd w:fill="ECB100" w:color="auto" w:val="clear"/>
+              </w:rPr>
+              <w:t xml:space="preserve">At CLP 3,555 the firm yields almost the same as its debt</w:t>
             </w:r>
           </w:p>
           <w:p>
@@ -744,11 +1887,51 @@
             <w:r>
               <w:rPr>
                 <w:rFonts w:ascii="Arial" w:cs="Arial" w:eastAsia="Arial" w:hAnsi="Arial"/>
-                <w:color w:val="1A1A1A"/>
-                <w:sz w:val="16"/>
-                <w:szCs w:val="16"/>
-              </w:rPr>
-              <w:t xml:space="preserve">Mallplaza trades at 16.8x EV/EBITDA, above the Chilean median (15.7x) and far above Brazilian peers (9.0x). The gap with Brazil is about rates, not quality: with local real bonds at 2.5% in Chile and 8.1% in Brazil (NTN-B), the cap-rate spread over the local rate is similar in both countries, 385 bp in Chile and 302 bp in Brazil (Figure 31). We therefore weight the Chilean median at 70% and the common-set median at 30% (which includes IRSA; we exclude Fibra Danhos for its FIBRA regime): 14.4x, giving CLP 2,951 per share. The weighting matters little: between 0% and 100% Chile, the target price only moves from CLP 1,916 to 2,144 (Appendix [E]).</w:t>
+                <w:b/>
+                <w:bCs/>
+                <w:color w:val="1A1A1A"/>
+                <w:sz w:val="12"/>
+                <w:szCs w:val="12"/>
+                <w:shd w:fill="ECB100" w:color="auto" w:val="clear"/>
+              </w:rPr>
+              <w:t xml:space="preserve">NEW</w:t>
+            </w:r>
+            <w:r>
+              <w:rPr>
+                <w:rFonts w:ascii="Arial" w:cs="Arial" w:eastAsia="Arial" w:hAnsi="Arial"/>
+                <w:color w:val="1A1A1A"/>
+                <w:sz w:val="16"/>
+                <w:szCs w:val="16"/>
+              </w:rPr>
+              <w:t xml:space="preserve"> </w:t>
+            </w:r>
+            <w:r>
+              <w:rPr>
+                <w:rFonts w:ascii="Arial" w:cs="Arial" w:eastAsia="Arial" w:hAnsi="Arial"/>
+                <w:color w:val="1A1A1A"/>
+                <w:sz w:val="16"/>
+                <w:szCs w:val="16"/>
+              </w:rPr>
+              <w:t xml:space="preserve">Mallplaza trades at 16.8x EV/EBITDA, above the Chilean median (15.7x) and far above Brazilian peers (9.0x). The gap with Brazil is about rates, not quality: with local real bonds at 2.5% in Chile and 8.1% in Brazil (NTN-B), the cap-rate spread</w:t>
+            </w:r>
+            <w:r>
+              <w:rPr>
+                <w:rFonts w:ascii="Arial" w:cs="Arial" w:eastAsia="Arial" w:hAnsi="Arial"/>
+                <w:color w:val="1A1A1A"/>
+                <w:sz w:val="16"/>
+                <w:szCs w:val="16"/>
+                <w:shd w:fill="ECB100" w:color="auto" w:val="clear"/>
+              </w:rPr>
+              <w:t xml:space="preserve"> (comparable to a real rate, since rents are indexed)</w:t>
+            </w:r>
+            <w:r>
+              <w:rPr>
+                <w:rFonts w:ascii="Arial" w:cs="Arial" w:eastAsia="Arial" w:hAnsi="Arial"/>
+                <w:color w:val="1A1A1A"/>
+                <w:sz w:val="16"/>
+                <w:szCs w:val="16"/>
+              </w:rPr>
+              <w:t xml:space="preserve"> over the local rate is similar in both countries, 385 bp in Chile and 302 bp in Brazil (Figure 31). We therefore weight the Chilean median at 70% and the common-set median at 30% (which includes IRSA; we exclude Fibra Danhos for its FIBRA regime): 14.4x, giving CLP 2,951 per share. The weighting matters little: between 0% and 100% Chile, the target price only moves from CLP 1,916 to 2,144 (Appendix [E]).</w:t>
             </w:r>
           </w:p>
           <w:p>
@@ -759,11 +1942,89 @@
             <w:r>
               <w:rPr>
                 <w:rFonts w:ascii="Arial" w:cs="Arial" w:eastAsia="Arial" w:hAnsi="Arial"/>
-                <w:color w:val="1A1A1A"/>
-                <w:sz w:val="16"/>
-                <w:szCs w:val="16"/>
-              </w:rPr>
-              <w:t xml:space="preserve">Macro explains the difference. At 30-Jun-26 Brazil had a 14.25% Selic, a 14.34% nominal 10-year bond and 5.3% expected 2026 inflation, against a 4.5% policy rate, a 5.43% nominal bond and 4.1% inflation in Chile, with similar growth (2.0% and 1.6%). An investor in Brazil demands more from every asset, not just shopping malls; applying that discount to Mallplaza, which earns 71.8% of revenue in Chile, would penalise it for a risk it does not carry. Mallplaza's own spread (346 bp) is in fact tighter than the Chilean median (385 bp): investors already pay it a premium within Chile.</w:t>
+                <w:b/>
+                <w:bCs/>
+                <w:color w:val="1A1A1A"/>
+                <w:sz w:val="12"/>
+                <w:szCs w:val="12"/>
+                <w:shd w:fill="ECB100" w:color="auto" w:val="clear"/>
+              </w:rPr>
+              <w:t xml:space="preserve">NEW</w:t>
+            </w:r>
+            <w:r>
+              <w:rPr>
+                <w:rFonts w:ascii="Arial" w:cs="Arial" w:eastAsia="Arial" w:hAnsi="Arial"/>
+                <w:color w:val="1A1A1A"/>
+                <w:sz w:val="16"/>
+                <w:szCs w:val="16"/>
+              </w:rPr>
+              <w:t xml:space="preserve"> </w:t>
+            </w:r>
+            <w:r>
+              <w:rPr>
+                <w:rFonts w:ascii="Arial" w:cs="Arial" w:eastAsia="Arial" w:hAnsi="Arial"/>
+                <w:color w:val="1A1A1A"/>
+                <w:sz w:val="16"/>
+                <w:szCs w:val="16"/>
+              </w:rPr>
+              <w:t xml:space="preserve">Macro explains the difference. At 30-Jun-26 Brazil had </w:t>
+            </w:r>
+            <w:r>
+              <w:rPr>
+                <w:rFonts w:ascii="Arial" w:cs="Arial" w:eastAsia="Arial" w:hAnsi="Arial"/>
+                <w:color w:val="1A1A1A"/>
+                <w:sz w:val="16"/>
+                <w:szCs w:val="16"/>
+                <w:shd w:fill="ECB100" w:color="auto" w:val="clear"/>
+              </w:rPr>
+              <w:t xml:space="preserve">a 14.25% nominal Selic</w:t>
+            </w:r>
+            <w:r>
+              <w:rPr>
+                <w:rFonts w:ascii="Arial" w:cs="Arial" w:eastAsia="Arial" w:hAnsi="Arial"/>
+                <w:color w:val="1A1A1A"/>
+                <w:sz w:val="16"/>
+                <w:szCs w:val="16"/>
+              </w:rPr>
+              <w:t xml:space="preserve">, a 14.34% nominal 10-year bond and 5.3% expected 2026 inflation, against </w:t>
+            </w:r>
+            <w:r>
+              <w:rPr>
+                <w:rFonts w:ascii="Arial" w:cs="Arial" w:eastAsia="Arial" w:hAnsi="Arial"/>
+                <w:color w:val="1A1A1A"/>
+                <w:sz w:val="16"/>
+                <w:szCs w:val="16"/>
+                <w:shd w:fill="ECB100" w:color="auto" w:val="clear"/>
+              </w:rPr>
+              <w:t xml:space="preserve">a 4.5% nominal policy rate</w:t>
+            </w:r>
+            <w:r>
+              <w:rPr>
+                <w:rFonts w:ascii="Arial" w:cs="Arial" w:eastAsia="Arial" w:hAnsi="Arial"/>
+                <w:color w:val="1A1A1A"/>
+                <w:sz w:val="16"/>
+                <w:szCs w:val="16"/>
+              </w:rPr>
+              <w:t xml:space="preserve">, a 5.43% nominal bond and 4.1% inflation in Chile, with similar </w:t>
+            </w:r>
+            <w:r>
+              <w:rPr>
+                <w:rFonts w:ascii="Arial" w:cs="Arial" w:eastAsia="Arial" w:hAnsi="Arial"/>
+                <w:color w:val="1A1A1A"/>
+                <w:sz w:val="16"/>
+                <w:szCs w:val="16"/>
+                <w:shd w:fill="ECB100" w:color="auto" w:val="clear"/>
+              </w:rPr>
+              <w:t xml:space="preserve">real GDP</w:t>
+            </w:r>
+            <w:r>
+              <w:rPr>
+                <w:rFonts w:ascii="Arial" w:cs="Arial" w:eastAsia="Arial" w:hAnsi="Arial"/>
+                <w:color w:val="1A1A1A"/>
+                <w:sz w:val="16"/>
+                <w:szCs w:val="16"/>
+              </w:rPr>
+              <w:t xml:space="preserve"> growth (2.0% and 1.6%). An investor in Brazil demands more from every asset, not just shopping malls; applying that discount to Mallplaza, which earns 71.8% of revenue in Chile, would penalise it for a risk it does not carry. Mallplaza's own spread (346 bp) is in fact tighter than the Chilean median (385 bp): investors already pay it a premium within Chile.</w:t>
             </w:r>
           </w:p>
           <w:p>
@@ -838,11 +2099,70 @@
             <w:r>
               <w:rPr>
                 <w:rFonts w:ascii="Arial" w:cs="Arial" w:eastAsia="Arial" w:hAnsi="Arial"/>
-                <w:color w:val="1A1A1A"/>
-                <w:sz w:val="16"/>
-                <w:szCs w:val="16"/>
-              </w:rPr>
-              <w:t xml:space="preserve">The price implies an EV of CLP 9.12 trillion, 69% above ours, and a 6.0% cap rate, against 10.1% in our DCF, 6.4% for Chilean peers and 7.5% at book value (Figure 33). The market pays 1.61x an equity base already at fair value, appraised at a ~5.55% real rate (Note 11): it pays more than the appraisers themselves. To justify CLP 3,555, the WACC would have to be 285 bp lower (Figure 34); even at the appraisers' rate, the DCF would be CLP 2,660.</w:t>
+                <w:b/>
+                <w:bCs/>
+                <w:color w:val="1A1A1A"/>
+                <w:sz w:val="12"/>
+                <w:szCs w:val="12"/>
+                <w:shd w:fill="ECB100" w:color="auto" w:val="clear"/>
+              </w:rPr>
+              <w:t xml:space="preserve">NEW</w:t>
+            </w:r>
+            <w:r>
+              <w:rPr>
+                <w:rFonts w:ascii="Arial" w:cs="Arial" w:eastAsia="Arial" w:hAnsi="Arial"/>
+                <w:color w:val="1A1A1A"/>
+                <w:sz w:val="16"/>
+                <w:szCs w:val="16"/>
+              </w:rPr>
+              <w:t xml:space="preserve"> </w:t>
+            </w:r>
+            <w:r>
+              <w:rPr>
+                <w:rFonts w:ascii="Arial" w:cs="Arial" w:eastAsia="Arial" w:hAnsi="Arial"/>
+                <w:color w:val="1A1A1A"/>
+                <w:sz w:val="16"/>
+                <w:szCs w:val="16"/>
+              </w:rPr>
+              <w:t xml:space="preserve">The price implies an EV of CLP 9.12 trillion, 69% above ours, and a 6.0% cap rate, against 10.1% in our DCF, 6.4% for Chilean peers and 7.5% at book value (Figure 33). The market pays 1.61x an equity base already at fair value, appraised at a ~5.55% real rate (Note 11): it pays more than the appraisers themselves. To justify CLP 3,555, the </w:t>
+            </w:r>
+            <w:r>
+              <w:rPr>
+                <w:rFonts w:ascii="Arial" w:cs="Arial" w:eastAsia="Arial" w:hAnsi="Arial"/>
+                <w:color w:val="1A1A1A"/>
+                <w:sz w:val="16"/>
+                <w:szCs w:val="16"/>
+                <w:shd w:fill="ECB100" w:color="auto" w:val="clear"/>
+              </w:rPr>
+              <w:t xml:space="preserve">nominal WACC would have to be 285 bp lower (7.56%; </w:t>
+            </w:r>
+            <w:r>
+              <w:rPr>
+                <w:rFonts w:ascii="Arial" w:cs="Arial" w:eastAsia="Arial" w:hAnsi="Arial"/>
+                <w:color w:val="1A1A1A"/>
+                <w:sz w:val="16"/>
+                <w:szCs w:val="16"/>
+              </w:rPr>
+              <w:t xml:space="preserve">Figure 34); even at the appraisers' rate</w:t>
+            </w:r>
+            <w:r>
+              <w:rPr>
+                <w:rFonts w:ascii="Arial" w:cs="Arial" w:eastAsia="Arial" w:hAnsi="Arial"/>
+                <w:color w:val="1A1A1A"/>
+                <w:sz w:val="16"/>
+                <w:szCs w:val="16"/>
+                <w:shd w:fill="ECB100" w:color="auto" w:val="clear"/>
+              </w:rPr>
+              <w:t xml:space="preserve"> (5.55% real, 8.72% nominal)</w:t>
+            </w:r>
+            <w:r>
+              <w:rPr>
+                <w:rFonts w:ascii="Arial" w:cs="Arial" w:eastAsia="Arial" w:hAnsi="Arial"/>
+                <w:color w:val="1A1A1A"/>
+                <w:sz w:val="16"/>
+                <w:szCs w:val="16"/>
+              </w:rPr>
+              <w:t xml:space="preserve">, the DCF would be CLP 2,660.</w:t>
             </w:r>
           </w:p>
           <w:p>
@@ -853,11 +2173,80 @@
             <w:r>
               <w:rPr>
                 <w:rFonts w:ascii="Arial" w:cs="Arial" w:eastAsia="Arial" w:hAnsi="Arial"/>
-                <w:color w:val="1A1A1A"/>
-                <w:sz w:val="16"/>
-                <w:szCs w:val="16"/>
-              </w:rPr>
-              <w:t xml:space="preserve">We pushed the thesis to its extremes. In a bear case (WACC +100 bp and the 75.8% quarterly-low margin) the target falls to CLP 1,713; in a bull case combining WACC −100 bp, g of 2.5%, the 81.3% quarterly-peak margin and the cut in corporate tax to 23%, it rises to CLP 2,627, still 26% below the price. APV (CLP 1,894), a peso-bond Rf (~CLP 2,439) and other debt targets (DCF of CLP 1,819 to 1,894) lead to the same conclusion (Appendix [F]).</w:t>
+                <w:b/>
+                <w:bCs/>
+                <w:color w:val="1A1A1A"/>
+                <w:sz w:val="12"/>
+                <w:szCs w:val="12"/>
+                <w:shd w:fill="ECB100" w:color="auto" w:val="clear"/>
+              </w:rPr>
+              <w:t xml:space="preserve">NEW</w:t>
+            </w:r>
+            <w:r>
+              <w:rPr>
+                <w:rFonts w:ascii="Arial" w:cs="Arial" w:eastAsia="Arial" w:hAnsi="Arial"/>
+                <w:color w:val="1A1A1A"/>
+                <w:sz w:val="16"/>
+                <w:szCs w:val="16"/>
+              </w:rPr>
+              <w:t xml:space="preserve"> </w:t>
+            </w:r>
+            <w:r>
+              <w:rPr>
+                <w:rFonts w:ascii="Arial" w:cs="Arial" w:eastAsia="Arial" w:hAnsi="Arial"/>
+                <w:color w:val="1A1A1A"/>
+                <w:sz w:val="16"/>
+                <w:szCs w:val="16"/>
+              </w:rPr>
+              <w:t xml:space="preserve">We pushed the thesis to its extremes. In a bear case (</w:t>
+            </w:r>
+            <w:r>
+              <w:rPr>
+                <w:rFonts w:ascii="Arial" w:cs="Arial" w:eastAsia="Arial" w:hAnsi="Arial"/>
+                <w:color w:val="1A1A1A"/>
+                <w:sz w:val="16"/>
+                <w:szCs w:val="16"/>
+                <w:shd w:fill="ECB100" w:color="auto" w:val="clear"/>
+              </w:rPr>
+              <w:t xml:space="preserve">nominal WACC +100 bp</w:t>
+            </w:r>
+            <w:r>
+              <w:rPr>
+                <w:rFonts w:ascii="Arial" w:cs="Arial" w:eastAsia="Arial" w:hAnsi="Arial"/>
+                <w:color w:val="1A1A1A"/>
+                <w:sz w:val="16"/>
+                <w:szCs w:val="16"/>
+              </w:rPr>
+              <w:t xml:space="preserve"> and the 75.8% quarterly-low margin) the target falls to CLP 1,713; in a bull case combining </w:t>
+            </w:r>
+            <w:r>
+              <w:rPr>
+                <w:rFonts w:ascii="Arial" w:cs="Arial" w:eastAsia="Arial" w:hAnsi="Arial"/>
+                <w:color w:val="1A1A1A"/>
+                <w:sz w:val="16"/>
+                <w:szCs w:val="16"/>
+                <w:shd w:fill="ECB100" w:color="auto" w:val="clear"/>
+              </w:rPr>
+              <w:t xml:space="preserve">nominal WACC −100 bp, nominal g of 2.5%</w:t>
+            </w:r>
+            <w:r>
+              <w:rPr>
+                <w:rFonts w:ascii="Arial" w:cs="Arial" w:eastAsia="Arial" w:hAnsi="Arial"/>
+                <w:color w:val="1A1A1A"/>
+                <w:sz w:val="16"/>
+                <w:szCs w:val="16"/>
+              </w:rPr>
+              <w:t xml:space="preserve">, the 81.3% quarterly-peak margin and the cut in corporate tax to 23%, it rises to CLP 2,627, still 26% below the price. APV (CLP 1,894), a peso-bond Rf (~CLP 2,439) and other debt targets (DCF of CLP 1,819 to 1,894) lead to the same conclusion (Appendix [F]). </w:t>
+            </w:r>
+            <w:r>
+              <w:rPr>
+                <w:rFonts w:ascii="Arial" w:cs="Arial" w:eastAsia="Arial" w:hAnsi="Arial"/>
+                <w:color w:val="1A1A1A"/>
+                <w:sz w:val="16"/>
+                <w:szCs w:val="16"/>
+                <w:shd w:fill="ECB100" w:color="auto" w:val="clear"/>
+              </w:rPr>
+              <w:t xml:space="preserve">The firm's IRR at the market price barely moves across scenarios (7.3%, 7.6% and 7.9% nominal in bear, base and bull; 4.2%, 4.4% and 4.7% real) and always stays below each one's WACC (409, 284 and 152 bp nominal): even the bull case leaves no margin of safety.</w:t>
             </w:r>
           </w:p>
           <w:p>
@@ -868,11 +2257,51 @@
             <w:r>
               <w:rPr>
                 <w:rFonts w:ascii="Arial" w:cs="Arial" w:eastAsia="Arial" w:hAnsi="Arial"/>
-                <w:color w:val="1A1A1A"/>
-                <w:sz w:val="16"/>
-                <w:szCs w:val="16"/>
-              </w:rPr>
-              <w:t xml:space="preserve">APV also shows what the debt is really worth. Of its CLP 1,894 per share, CLP 1,632 is the unlevered firm and CLP 261 the tax shields of projected debt: levering up to 3.5x adds value, but even with it the price is far away. And our risk-free choice is the conservative one: using the peso bond (5.43%) and then adding country risk would count Chile risk twice, and even so the target price would only rise to ~CLP 2,439, 31% below the price. In other words, no reasonable choice of inputs rescues the current valuation; the gap is too wide to be a modelling artefact.</w:t>
+                <w:b/>
+                <w:bCs/>
+                <w:color w:val="1A1A1A"/>
+                <w:sz w:val="12"/>
+                <w:szCs w:val="12"/>
+                <w:shd w:fill="ECB100" w:color="auto" w:val="clear"/>
+              </w:rPr>
+              <w:t xml:space="preserve">NEW</w:t>
+            </w:r>
+            <w:r>
+              <w:rPr>
+                <w:rFonts w:ascii="Arial" w:cs="Arial" w:eastAsia="Arial" w:hAnsi="Arial"/>
+                <w:color w:val="1A1A1A"/>
+                <w:sz w:val="16"/>
+                <w:szCs w:val="16"/>
+              </w:rPr>
+              <w:t xml:space="preserve"> </w:t>
+            </w:r>
+            <w:r>
+              <w:rPr>
+                <w:rFonts w:ascii="Arial" w:cs="Arial" w:eastAsia="Arial" w:hAnsi="Arial"/>
+                <w:color w:val="1A1A1A"/>
+                <w:sz w:val="16"/>
+                <w:szCs w:val="16"/>
+              </w:rPr>
+              <w:t xml:space="preserve">APV also shows what the debt is really worth. Of its CLP 1,894 per share, CLP 1,632 is the unlevered firm and CLP 261 the tax shields of projected debt: levering up to 3.5x adds value, but even with it the price is far away. And our risk-free choice is the conservative one: using </w:t>
+            </w:r>
+            <w:r>
+              <w:rPr>
+                <w:rFonts w:ascii="Arial" w:cs="Arial" w:eastAsia="Arial" w:hAnsi="Arial"/>
+                <w:color w:val="1A1A1A"/>
+                <w:sz w:val="16"/>
+                <w:szCs w:val="16"/>
+                <w:shd w:fill="ECB100" w:color="auto" w:val="clear"/>
+              </w:rPr>
+              <w:t xml:space="preserve">the nominal peso bond (5.43%)</w:t>
+            </w:r>
+            <w:r>
+              <w:rPr>
+                <w:rFonts w:ascii="Arial" w:cs="Arial" w:eastAsia="Arial" w:hAnsi="Arial"/>
+                <w:color w:val="1A1A1A"/>
+                <w:sz w:val="16"/>
+                <w:szCs w:val="16"/>
+              </w:rPr>
+              <w:t xml:space="preserve"> and then adding country risk would count Chile risk twice, and even so the target price would only rise to ~CLP 2,439, 31% below the price. In other words, no reasonable choice of inputs rescues the current valuation; the gap is too wide to be a modelling artefact.</w:t>
             </w:r>
           </w:p>
           <w:p>
@@ -898,11 +2327,51 @@
             <w:r>
               <w:rPr>
                 <w:rFonts w:ascii="Arial" w:cs="Arial" w:eastAsia="Arial" w:hAnsi="Arial"/>
-                <w:color w:val="1A1A1A"/>
-                <w:sz w:val="16"/>
-                <w:szCs w:val="16"/>
-              </w:rPr>
-              <w:t xml:space="preserve">That brings us to CLP 2,076 (80% × 1,857 + 20% × 2,951): 10.8x EBITDA, a 9.3% cap rate and 0.94x book value. Rolling the DCF to 30-Sep-26 would lift it to ~CLP 2,118 without changing the call. The catalyst is the same force behind the thesis: with the 10Y UST at 5.22%, its highest since 2002, rates pressure cap rates, and each new appraisal moves them toward our value. We would be wrong if cap rates compress further on institutional demand for defensive assets, or if the market sustains a structural premium for Tier A assets (see Investment Risks).</w:t>
+                <w:b/>
+                <w:bCs/>
+                <w:color w:val="1A1A1A"/>
+                <w:sz w:val="12"/>
+                <w:szCs w:val="12"/>
+                <w:shd w:fill="ECB100" w:color="auto" w:val="clear"/>
+              </w:rPr>
+              <w:t xml:space="preserve">NEW</w:t>
+            </w:r>
+            <w:r>
+              <w:rPr>
+                <w:rFonts w:ascii="Arial" w:cs="Arial" w:eastAsia="Arial" w:hAnsi="Arial"/>
+                <w:color w:val="1A1A1A"/>
+                <w:sz w:val="16"/>
+                <w:szCs w:val="16"/>
+              </w:rPr>
+              <w:t xml:space="preserve"> </w:t>
+            </w:r>
+            <w:r>
+              <w:rPr>
+                <w:rFonts w:ascii="Arial" w:cs="Arial" w:eastAsia="Arial" w:hAnsi="Arial"/>
+                <w:color w:val="1A1A1A"/>
+                <w:sz w:val="16"/>
+                <w:szCs w:val="16"/>
+              </w:rPr>
+              <w:t xml:space="preserve">That brings us to CLP 2,076 (80% × 1,857 + 20% × 2,951): 10.8x EBITDA, a 9.3% cap rate and 0.94x book value. Rolling the DCF to 30-Sep-26 would lift it to ~CLP 2,118 without changing the call. The catalyst is the same force behind the thesis: with the </w:t>
+            </w:r>
+            <w:r>
+              <w:rPr>
+                <w:rFonts w:ascii="Arial" w:cs="Arial" w:eastAsia="Arial" w:hAnsi="Arial"/>
+                <w:color w:val="1A1A1A"/>
+                <w:sz w:val="16"/>
+                <w:szCs w:val="16"/>
+                <w:shd w:fill="ECB100" w:color="auto" w:val="clear"/>
+              </w:rPr>
+              <w:t xml:space="preserve">nominal 10Y UST</w:t>
+            </w:r>
+            <w:r>
+              <w:rPr>
+                <w:rFonts w:ascii="Arial" w:cs="Arial" w:eastAsia="Arial" w:hAnsi="Arial"/>
+                <w:color w:val="1A1A1A"/>
+                <w:sz w:val="16"/>
+                <w:szCs w:val="16"/>
+              </w:rPr>
+              <w:t xml:space="preserve"> at 5.22%, its highest since 2002, rates pressure cap rates, and each new appraisal moves them toward our value. We would be wrong if cap rates compress further on institutional demand for defensive assets, or if the market sustains a structural premium for Tier A assets (see Investment Risks).</w:t>
             </w:r>
           </w:p>
           <w:p>
@@ -913,11 +2382,89 @@
             <w:r>
               <w:rPr>
                 <w:rFonts w:ascii="Arial" w:cs="Arial" w:eastAsia="Arial" w:hAnsi="Arial"/>
-                <w:color w:val="1A1A1A"/>
-                <w:sz w:val="16"/>
-                <w:szCs w:val="16"/>
-              </w:rPr>
-              <w:t xml:space="preserve">What we will watch: the Note 11 appraisal at each reporting date (the real discount rate is the bridge between our value and book), the spread of the company's UF bonds over their 3.6% coupon (at the latest issue's 4.33% effective rate, the WACC would rise 12 bp and the target would fall to CLP 2,042), the cut in corporate tax to 23% (+5.1% on the target, not yet included) and the AAA rating, which would likely come under pressure at 3.5x net debt/EBITDA. In short, the operating story is sound; it is the price of that story that no longer adds up.</w:t>
+                <w:b/>
+                <w:bCs/>
+                <w:color w:val="1A1A1A"/>
+                <w:sz w:val="12"/>
+                <w:szCs w:val="12"/>
+                <w:shd w:fill="ECB100" w:color="auto" w:val="clear"/>
+              </w:rPr>
+              <w:t xml:space="preserve">NEW</w:t>
+            </w:r>
+            <w:r>
+              <w:rPr>
+                <w:rFonts w:ascii="Arial" w:cs="Arial" w:eastAsia="Arial" w:hAnsi="Arial"/>
+                <w:color w:val="1A1A1A"/>
+                <w:sz w:val="16"/>
+                <w:szCs w:val="16"/>
+              </w:rPr>
+              <w:t xml:space="preserve"> </w:t>
+            </w:r>
+            <w:r>
+              <w:rPr>
+                <w:rFonts w:ascii="Arial" w:cs="Arial" w:eastAsia="Arial" w:hAnsi="Arial"/>
+                <w:color w:val="1A1A1A"/>
+                <w:sz w:val="16"/>
+                <w:szCs w:val="16"/>
+              </w:rPr>
+              <w:t xml:space="preserve">What we will watch: the Note 11 appraisal at each reporting date (the real discount rate is the bridge between our value and book), the spread of the company's UF bonds over their </w:t>
+            </w:r>
+            <w:r>
+              <w:rPr>
+                <w:rFonts w:ascii="Arial" w:cs="Arial" w:eastAsia="Arial" w:hAnsi="Arial"/>
+                <w:color w:val="1A1A1A"/>
+                <w:sz w:val="16"/>
+                <w:szCs w:val="16"/>
+                <w:shd w:fill="ECB100" w:color="auto" w:val="clear"/>
+              </w:rPr>
+              <w:t xml:space="preserve">3.6% real coupon</w:t>
+            </w:r>
+            <w:r>
+              <w:rPr>
+                <w:rFonts w:ascii="Arial" w:cs="Arial" w:eastAsia="Arial" w:hAnsi="Arial"/>
+                <w:color w:val="1A1A1A"/>
+                <w:sz w:val="16"/>
+                <w:szCs w:val="16"/>
+              </w:rPr>
+              <w:t xml:space="preserve"> (at the latest issue's </w:t>
+            </w:r>
+            <w:r>
+              <w:rPr>
+                <w:rFonts w:ascii="Arial" w:cs="Arial" w:eastAsia="Arial" w:hAnsi="Arial"/>
+                <w:color w:val="1A1A1A"/>
+                <w:sz w:val="16"/>
+                <w:szCs w:val="16"/>
+                <w:shd w:fill="ECB100" w:color="auto" w:val="clear"/>
+              </w:rPr>
+              <w:t xml:space="preserve">4.33% real effective rate</w:t>
+            </w:r>
+            <w:r>
+              <w:rPr>
+                <w:rFonts w:ascii="Arial" w:cs="Arial" w:eastAsia="Arial" w:hAnsi="Arial"/>
+                <w:color w:val="1A1A1A"/>
+                <w:sz w:val="16"/>
+                <w:szCs w:val="16"/>
+              </w:rPr>
+              <w:t xml:space="preserve">, the </w:t>
+            </w:r>
+            <w:r>
+              <w:rPr>
+                <w:rFonts w:ascii="Arial" w:cs="Arial" w:eastAsia="Arial" w:hAnsi="Arial"/>
+                <w:color w:val="1A1A1A"/>
+                <w:sz w:val="16"/>
+                <w:szCs w:val="16"/>
+                <w:shd w:fill="ECB100" w:color="auto" w:val="clear"/>
+              </w:rPr>
+              <w:t xml:space="preserve">nominal WACC would rise 12 bp</w:t>
+            </w:r>
+            <w:r>
+              <w:rPr>
+                <w:rFonts w:ascii="Arial" w:cs="Arial" w:eastAsia="Arial" w:hAnsi="Arial"/>
+                <w:color w:val="1A1A1A"/>
+                <w:sz w:val="16"/>
+                <w:szCs w:val="16"/>
+              </w:rPr>
+              <w:t xml:space="preserve"> and the target would fall to CLP 2,042), the cut in corporate tax to 23% (+5.1% on the target, not yet included) and the AAA rating, which would likely come under pressure at 3.5x net debt/EBITDA. In short, the operating story is sound; it is the price of that story that no longer adds up.</w:t>
             </w:r>
           </w:p>
         </w:tc>
@@ -1227,11 +2774,33 @@
             <w:r>
               <w:rPr>
                 <w:rFonts w:ascii="Arial" w:cs="Arial" w:eastAsia="Arial" w:hAnsi="Arial"/>
+                <w:b/>
+                <w:bCs/>
+                <w:color w:val="14284B"/>
+                <w:sz w:val="12"/>
+                <w:szCs w:val="12"/>
+                <w:shd w:fill="ECB100" w:color="auto" w:val="clear"/>
+              </w:rPr>
+              <w:t xml:space="preserve">NEW</w:t>
+            </w:r>
+            <w:r>
+              <w:rPr>
+                <w:rFonts w:ascii="Arial" w:cs="Arial" w:eastAsia="Arial" w:hAnsi="Arial"/>
                 <w:color w:val="14284B"/>
                 <w:sz w:val="14"/>
                 <w:szCs w:val="14"/>
               </w:rPr>
-              <w:t xml:space="preserve">The price requires a WACC 285 bp lower</w:t>
+              <w:t xml:space="preserve"> </w:t>
+            </w:r>
+            <w:r>
+              <w:rPr>
+                <w:rFonts w:ascii="Arial" w:cs="Arial" w:eastAsia="Arial" w:hAnsi="Arial"/>
+                <w:color w:val="14284B"/>
+                <w:sz w:val="14"/>
+                <w:szCs w:val="14"/>
+                <w:shd w:fill="ECB100" w:color="auto" w:val="clear"/>
+              </w:rPr>
+              <w:t xml:space="preserve">The price requires a nominal WACC 285 bp lower</w:t>
             </w:r>
           </w:p>
           <w:p>

</xml_diff>

<commit_message>
Valuation: label cap rates as nominal EBITDA/EV yields, flag appraiser rate as real discount rate (text and figures V5, V7)
Co-Authored-By: Claude Sonnet 5.5 <noreply@anthropic.com>
Claude-Session: https://claude.ai/code/session_0188QZHBkA8n5QL7BtmFakQg
</commit_message>
<xml_diff>
--- a/secciones/valuacion/documento/Mallplaza_Valuacion_EN.docx
+++ b/secciones/valuacion/documento/Mallplaza_Valuacion_EN.docx
@@ -1922,7 +1922,7 @@
                 <w:szCs w:val="16"/>
                 <w:shd w:fill="ECB100" w:color="auto" w:val="clear"/>
               </w:rPr>
-              <w:t xml:space="preserve"> (comparable to a real rate, since rents are indexed)</w:t>
+              <w:t xml:space="preserve"> (nominal EBITDA/EV yield; UF indexation of rents brings it close to a real rate)</w:t>
             </w:r>
             <w:r>
               <w:rPr>
@@ -2124,7 +2124,64 @@
                 <w:sz w:val="16"/>
                 <w:szCs w:val="16"/>
               </w:rPr>
-              <w:t xml:space="preserve">The price implies an EV of CLP 9.12 trillion, 69% above ours, and a 6.0% cap rate, against 10.1% in our DCF, 6.4% for Chilean peers and 7.5% at book value (Figure 33). The market pays 1.61x an equity base already at fair value, appraised at a ~5.55% real rate (Note 11): it pays more than the appraisers themselves. To justify CLP 3,555, the </w:t>
+              <w:t xml:space="preserve">The price implies an EV of CLP 9.12 trillion, 69% above ours, and a </w:t>
+            </w:r>
+            <w:r>
+              <w:rPr>
+                <w:rFonts w:ascii="Arial" w:cs="Arial" w:eastAsia="Arial" w:hAnsi="Arial"/>
+                <w:color w:val="1A1A1A"/>
+                <w:sz w:val="16"/>
+                <w:szCs w:val="16"/>
+                <w:shd w:fill="ECB100" w:color="auto" w:val="clear"/>
+              </w:rPr>
+              <w:t xml:space="preserve">nominal (EBITDA/EV)</w:t>
+            </w:r>
+            <w:r>
+              <w:rPr>
+                <w:rFonts w:ascii="Arial" w:cs="Arial" w:eastAsia="Arial" w:hAnsi="Arial"/>
+                <w:color w:val="1A1A1A"/>
+                <w:sz w:val="16"/>
+                <w:szCs w:val="16"/>
+              </w:rPr>
+              <w:t xml:space="preserve"> 6.0% cap rate, against 10.1% in our DCF, 6.4% for Chilean peers and 7.5% at book value (Figure 33). The market pays 1.61x an equity base already at fair value, appraised at </w:t>
+            </w:r>
+            <w:r>
+              <w:rPr>
+                <w:rFonts w:ascii="Arial" w:cs="Arial" w:eastAsia="Arial" w:hAnsi="Arial"/>
+                <w:color w:val="1A1A1A"/>
+                <w:sz w:val="16"/>
+                <w:szCs w:val="16"/>
+                <w:shd w:fill="ECB100" w:color="auto" w:val="clear"/>
+              </w:rPr>
+              <w:t xml:space="preserve">a real discount rate of ~5.55%</w:t>
+            </w:r>
+            <w:r>
+              <w:rPr>
+                <w:rFonts w:ascii="Arial" w:cs="Arial" w:eastAsia="Arial" w:hAnsi="Arial"/>
+                <w:color w:val="1A1A1A"/>
+                <w:sz w:val="16"/>
+                <w:szCs w:val="16"/>
+              </w:rPr>
+              <w:t xml:space="preserve"> (Note 11)</w:t>
+            </w:r>
+            <w:r>
+              <w:rPr>
+                <w:rFonts w:ascii="Arial" w:cs="Arial" w:eastAsia="Arial" w:hAnsi="Arial"/>
+                <w:color w:val="1A1A1A"/>
+                <w:sz w:val="16"/>
+                <w:szCs w:val="16"/>
+                <w:shd w:fill="ECB100" w:color="auto" w:val="clear"/>
+              </w:rPr>
+              <w:t xml:space="preserve">, not directly comparable with the cap rate</w:t>
+            </w:r>
+            <w:r>
+              <w:rPr>
+                <w:rFonts w:ascii="Arial" w:cs="Arial" w:eastAsia="Arial" w:hAnsi="Arial"/>
+                <w:color w:val="1A1A1A"/>
+                <w:sz w:val="16"/>
+                <w:szCs w:val="16"/>
+              </w:rPr>
+              <w:t xml:space="preserve">: it pays more than the appraisers themselves. To justify CLP 3,555, the </w:t>
             </w:r>
             <w:r>
               <w:rPr>
@@ -2352,7 +2409,26 @@
                 <w:sz w:val="16"/>
                 <w:szCs w:val="16"/>
               </w:rPr>
-              <w:t xml:space="preserve">That brings us to CLP 2,076 (80% × 1,857 + 20% × 2,951): 10.8x EBITDA, a 9.3% cap rate and 0.94x book value. Rolling the DCF to 30-Sep-26 would lift it to ~CLP 2,118 without changing the call. The catalyst is the same force behind the thesis: with the </w:t>
+              <w:t xml:space="preserve">That brings us to CLP 2,076 (80% × 1,857 + 20% × 2,951): 10.8x EBITDA, </w:t>
+            </w:r>
+            <w:r>
+              <w:rPr>
+                <w:rFonts w:ascii="Arial" w:cs="Arial" w:eastAsia="Arial" w:hAnsi="Arial"/>
+                <w:color w:val="1A1A1A"/>
+                <w:sz w:val="16"/>
+                <w:szCs w:val="16"/>
+                <w:shd w:fill="ECB100" w:color="auto" w:val="clear"/>
+              </w:rPr>
+              <w:t xml:space="preserve">a nominal 9.3% cap rate</w:t>
+            </w:r>
+            <w:r>
+              <w:rPr>
+                <w:rFonts w:ascii="Arial" w:cs="Arial" w:eastAsia="Arial" w:hAnsi="Arial"/>
+                <w:color w:val="1A1A1A"/>
+                <w:sz w:val="16"/>
+                <w:szCs w:val="16"/>
+              </w:rPr>
+              <w:t xml:space="preserve"> and 0.94x book value. Rolling the DCF to 30-Sep-26 would lift it to ~CLP 2,118 without changing the call. The catalyst is the same force behind the thesis: with the </w:t>
             </w:r>
             <w:r>
               <w:rPr>
@@ -2585,7 +2661,7 @@
                 <w:sz w:val="11"/>
                 <w:szCs w:val="11"/>
               </w:rPr>
-              <w:t xml:space="preserve">Real bond: 10Y UF (Central Bank of Chile) and NTN-B 2035 (8.08%) at 30-Jun-26. Spread = cap rate (1 / EV/EBITDA) − real bond. IRSA omitted (IAS 29). Source: Bloomberg; Central Bank of Chile; Team analysis.</w:t>
+              <w:t xml:space="preserve">Real bond: 10Y UF (Central Bank of Chile) and NTN-B 2035 (8.08%) at 30-Jun-26. Spread = nominal cap rate (1 / EV/EBITDA) − real bond. IRSA omitted (IAS 29). Source: Bloomberg; Central Bank of Chile; Team analysis.</w:t>
             </w:r>
           </w:p>
           <w:p>

</xml_diff>

<commit_message>
Valuation: compare nominal with nominal and real with real (cap rate as real-basis yield, IRR vs appraiser real rate)
Co-Authored-By: Claude Sonnet 5.5 <noreply@anthropic.com>
Claude-Session: https://claude.ai/code/session_0188QZHBkA8n5QL7BtmFakQg
</commit_message>
<xml_diff>
--- a/secciones/valuacion/documento/Mallplaza_Valuacion_EN.docx
+++ b/secciones/valuacion/documento/Mallplaza_Valuacion_EN.docx
@@ -1922,7 +1922,7 @@
                 <w:szCs w:val="16"/>
                 <w:shd w:fill="ECB100" w:color="auto" w:val="clear"/>
               </w:rPr>
-              <w:t xml:space="preserve"> (nominal EBITDA/EV yield; UF indexation of rents brings it close to a real rate)</w:t>
+              <w:t xml:space="preserve"> (EBITDA/EV yield; with UF-indexed rents it is compared with real rates)</w:t>
             </w:r>
             <w:r>
               <w:rPr>
@@ -2124,26 +2124,26 @@
                 <w:sz w:val="16"/>
                 <w:szCs w:val="16"/>
               </w:rPr>
-              <w:t xml:space="preserve">The price implies an EV of CLP 9.12 trillion, 69% above ours, and a </w:t>
-            </w:r>
-            <w:r>
-              <w:rPr>
-                <w:rFonts w:ascii="Arial" w:cs="Arial" w:eastAsia="Arial" w:hAnsi="Arial"/>
-                <w:color w:val="1A1A1A"/>
-                <w:sz w:val="16"/>
-                <w:szCs w:val="16"/>
-                <w:shd w:fill="ECB100" w:color="auto" w:val="clear"/>
-              </w:rPr>
-              <w:t xml:space="preserve">nominal (EBITDA/EV)</w:t>
-            </w:r>
-            <w:r>
-              <w:rPr>
-                <w:rFonts w:ascii="Arial" w:cs="Arial" w:eastAsia="Arial" w:hAnsi="Arial"/>
-                <w:color w:val="1A1A1A"/>
-                <w:sz w:val="16"/>
-                <w:szCs w:val="16"/>
-              </w:rPr>
-              <w:t xml:space="preserve"> 6.0% cap rate, against 10.1% in our DCF, 6.4% for Chilean peers and 7.5% at book value (Figure 33). The market pays 1.61x an equity base already at fair value, appraised at </w:t>
+              <w:t xml:space="preserve">The price implies an EV of CLP 9.12 trillion, 69% above ours, and </w:t>
+            </w:r>
+            <w:r>
+              <w:rPr>
+                <w:rFonts w:ascii="Arial" w:cs="Arial" w:eastAsia="Arial" w:hAnsi="Arial"/>
+                <w:color w:val="1A1A1A"/>
+                <w:sz w:val="16"/>
+                <w:szCs w:val="16"/>
+                <w:shd w:fill="ECB100" w:color="auto" w:val="clear"/>
+              </w:rPr>
+              <w:t xml:space="preserve">a real 6.0% cap rate</w:t>
+            </w:r>
+            <w:r>
+              <w:rPr>
+                <w:rFonts w:ascii="Arial" w:cs="Arial" w:eastAsia="Arial" w:hAnsi="Arial"/>
+                <w:color w:val="1A1A1A"/>
+                <w:sz w:val="16"/>
+                <w:szCs w:val="16"/>
+              </w:rPr>
+              <w:t xml:space="preserve">, against 10.1% in our DCF, 6.4% for Chilean peers and 7.5% at book value (Figure 33). The market pays 1.61x an equity base already at fair value, appraised at </w:t>
             </w:r>
             <w:r>
               <w:rPr>
@@ -2172,7 +2172,7 @@
                 <w:szCs w:val="16"/>
                 <w:shd w:fill="ECB100" w:color="auto" w:val="clear"/>
               </w:rPr>
-              <w:t xml:space="preserve">, not directly comparable with the cap rate</w:t>
+              <w:t xml:space="preserve">; the real IRR the price leaves, 4.4%, is below that rate</w:t>
             </w:r>
             <w:r>
               <w:rPr>
@@ -2419,7 +2419,7 @@
                 <w:szCs w:val="16"/>
                 <w:shd w:fill="ECB100" w:color="auto" w:val="clear"/>
               </w:rPr>
-              <w:t xml:space="preserve">a nominal 9.3% cap rate</w:t>
+              <w:t xml:space="preserve">a real 9.3% cap rate</w:t>
             </w:r>
             <w:r>
               <w:rPr>
@@ -2661,7 +2661,7 @@
                 <w:sz w:val="11"/>
                 <w:szCs w:val="11"/>
               </w:rPr>
-              <w:t xml:space="preserve">Real bond: 10Y UF (Central Bank of Chile) and NTN-B 2035 (8.08%) at 30-Jun-26. Spread = nominal cap rate (1 / EV/EBITDA) − real bond. IRSA omitted (IAS 29). Source: Bloomberg; Central Bank of Chile; Team analysis.</w:t>
+              <w:t xml:space="preserve">Real bond: 10Y UF (Central Bank of Chile) and NTN-B 2035 (8.08%) at 30-Jun-26. Spread = cap rate (1 / EV/EBITDA) − real bond. IRSA omitted (IAS 29). Source: Bloomberg; Central Bank of Chile; Team analysis.</w:t>
             </w:r>
           </w:p>
           <w:p>

</xml_diff>

<commit_message>
Valuation: asset IRR as headline and table; assumptions waterfall (Figure 29) incl. tax-shield effect; pending items updated
Co-Authored-By: Claude Sonnet 5.5 <noreply@anthropic.com>
Claude-Session: https://claude.ai/code/session_0188QZHBkA8n5QL7BtmFakQg
</commit_message>
<xml_diff>
--- a/secciones/valuacion/documento/Mallplaza_Valuacion_EN.docx
+++ b/secciones/valuacion/documento/Mallplaza_Valuacion_EN.docx
@@ -390,16 +390,16 @@
                 <w:szCs w:val="16"/>
                 <w:shd w:fill="ECB100" w:color="auto" w:val="clear"/>
               </w:rPr>
-              <w:t xml:space="preserve">The first signal is the IRR, what someone buying at CLP 3,555 earns if our cash flows come true: for the firm, 7.57% nominal (4.44% real in UF), 284 bp below its WACC and just ~80 bp real above its real cost of debt (Figure 28); for the shareholder, −2.0% nominal against a 11.93% Ke.</w:t>
-            </w:r>
-            <w:r>
-              <w:rPr>
-                <w:rFonts w:ascii="Arial" w:cs="Arial" w:eastAsia="Arial" w:hAnsi="Arial"/>
-                <w:color w:val="1A1A1A"/>
-                <w:sz w:val="16"/>
-                <w:szCs w:val="16"/>
-              </w:rPr>
-              <w:t xml:space="preserve"> The market is pricing the stock almost as if it were a bond.</w:t>
+              <w:t xml:space="preserve">The first signal is the asset IRR, what the business earns for whoever buys it at CLP 3,555 if our cash flows come true: 7.57% nominal (4.44% real in UF), 284 bp below its WACC and just ~80 bp real above its real cost of debt (Figure 28).</w:t>
+            </w:r>
+            <w:r>
+              <w:rPr>
+                <w:rFonts w:ascii="Arial" w:cs="Arial" w:eastAsia="Arial" w:hAnsi="Arial"/>
+                <w:color w:val="1A1A1A"/>
+                <w:sz w:val="16"/>
+                <w:szCs w:val="16"/>
+              </w:rPr>
+              <w:t xml:space="preserve"> The market is pricing the business almost as if it were a bond.</w:t>
             </w:r>
           </w:p>
           <w:p>
@@ -438,7 +438,7 @@
                 <w:szCs w:val="14"/>
                 <w:shd w:fill="ECB100" w:color="auto" w:val="clear"/>
               </w:rPr>
-              <w:t xml:space="preserve">IRR at the market price vs cost of capital: nominal CLP and real (UF)</w:t>
+              <w:t xml:space="preserve">Asset (firm) IRR vs its WACC: nominal CLP and real (UF)</w:t>
             </w:r>
           </w:p>
           <w:tbl>
@@ -494,7 +494,7 @@
                       <w:sz w:val="13"/>
                       <w:szCs w:val="13"/>
                     </w:rPr>
-                    <w:t xml:space="preserve">Buying at CLP 3,555</w:t>
+                    <w:t xml:space="preserve">Buying at the price of</w:t>
                   </w:r>
                 </w:p>
               </w:tc>
@@ -596,7 +596,7 @@
                       <w:sz w:val="13"/>
                       <w:szCs w:val="13"/>
                     </w:rPr>
-                    <w:t xml:space="preserve">Cost of cap. nom./real</w:t>
+                    <w:t xml:space="preserve">WACC nom./real</w:t>
                   </w:r>
                 </w:p>
               </w:tc>
@@ -669,7 +669,7 @@
                       <w:szCs w:val="13"/>
                       <w:shd w:fill="ECB100" w:color="auto" w:val="clear"/>
                     </w:rPr>
-                    <w:t xml:space="preserve">Firm (FCFF), single rate</w:t>
+                    <w:t xml:space="preserve">Market: CLP 3,555</w:t>
                   </w:r>
                 </w:p>
               </w:tc>
@@ -856,7 +856,7 @@
                       <w:szCs w:val="13"/>
                       <w:shd w:fill="ECB100" w:color="auto" w:val="clear"/>
                     </w:rPr>
-                    <w:t xml:space="preserve">Shareholder, exits at our value</w:t>
+                    <w:t xml:space="preserve">Our target: CLP 2,076</w:t>
                   </w:r>
                 </w:p>
               </w:tc>
@@ -893,7 +893,7 @@
                       <w:szCs w:val="13"/>
                       <w:shd w:fill="ECB100" w:color="auto" w:val="clear"/>
                     </w:rPr>
-                    <w:t xml:space="preserve">−2.0%</w:t>
+                    <w:t xml:space="preserve">9.87%</w:t>
                   </w:r>
                 </w:p>
               </w:tc>
@@ -930,7 +930,7 @@
                       <w:szCs w:val="13"/>
                       <w:shd w:fill="ECB100" w:color="auto" w:val="clear"/>
                     </w:rPr>
-                    <w:t xml:space="preserve">−4.9%</w:t>
+                    <w:t xml:space="preserve">6.67%</w:t>
                   </w:r>
                 </w:p>
               </w:tc>
@@ -967,7 +967,7 @@
                       <w:szCs w:val="13"/>
                       <w:shd w:fill="ECB100" w:color="auto" w:val="clear"/>
                     </w:rPr>
-                    <w:t xml:space="preserve">Ke 11.93% / 8.67%</w:t>
+                    <w:t xml:space="preserve">WACC 10.41% / 7.20%</w:t>
                   </w:r>
                 </w:p>
               </w:tc>
@@ -1004,7 +1004,7 @@
                       <w:szCs w:val="13"/>
                       <w:shd w:fill="ECB100" w:color="auto" w:val="clear"/>
                     </w:rPr>
-                    <w:t xml:space="preserve">−1,395 / −1,354 bp</w:t>
+                    <w:t xml:space="preserve">−54 / −53 bp</w:t>
                   </w:r>
                 </w:p>
               </w:tc>
@@ -1043,7 +1043,7 @@
                       <w:szCs w:val="13"/>
                       <w:shd w:fill="ECB100" w:color="auto" w:val="clear"/>
                     </w:rPr>
-                    <w:t xml:space="preserve">Shareholder, buys at target</w:t>
+                    <w:t xml:space="preserve">Our DCF: CLP 1,857</w:t>
                   </w:r>
                 </w:p>
               </w:tc>
@@ -1080,7 +1080,7 @@
                       <w:szCs w:val="13"/>
                       <w:shd w:fill="ECB100" w:color="auto" w:val="clear"/>
                     </w:rPr>
-                    <w:t xml:space="preserve">10.6%</w:t>
+                    <w:t xml:space="preserve">10.43%</w:t>
                   </w:r>
                 </w:p>
               </w:tc>
@@ -1117,7 +1117,7 @@
                       <w:szCs w:val="13"/>
                       <w:shd w:fill="ECB100" w:color="auto" w:val="clear"/>
                     </w:rPr>
-                    <w:t xml:space="preserve">7.4%</w:t>
+                    <w:t xml:space="preserve">7.21%</w:t>
                   </w:r>
                 </w:p>
               </w:tc>
@@ -1154,7 +1154,7 @@
                       <w:szCs w:val="13"/>
                       <w:shd w:fill="ECB100" w:color="auto" w:val="clear"/>
                     </w:rPr>
-                    <w:t xml:space="preserve">Ke 11.93% / 8.67%</w:t>
+                    <w:t xml:space="preserve">WACC 10.41% / 7.20%</w:t>
                   </w:r>
                 </w:p>
               </w:tc>
@@ -1191,7 +1191,7 @@
                       <w:szCs w:val="13"/>
                       <w:shd w:fill="ECB100" w:color="auto" w:val="clear"/>
                     </w:rPr>
-                    <w:t xml:space="preserve">−135 / −131 bp</w:t>
+                    <w:t xml:space="preserve">+2 / +2 bp</w:t>
                   </w:r>
                 </w:p>
               </w:tc>
@@ -1210,7 +1210,7 @@
                 <w:szCs w:val="11"/>
                 <w:shd w:fill="ECB100" w:color="auto" w:val="clear"/>
               </w:rPr>
-              <w:t xml:space="preserve">IRR: the rate that equates the value of the cash flows to the price. Firm: a single rate on FCFF and terminal value (Figure 34 shifts the whole WACC curve and gives 7.56%; both give CLP 3,555). Shareholder: the model's distributions (with the extra one that takes net debt/EBITDA to 3.5x) and exit at 31-Dec-31 at our value. Real = (1 + nom.) / (1 + 3.0%) − 1. Source: model v3, TIR_Accionista sheet.</w:t>
+              <w:t xml:space="preserve">Asset IRR: the single rate that equates FCFF and terminal value to the enterprise value paid (price × shares + net debt + minorities). At the DCF value it equals the WACC. Figure 34 shifts the whole WACC curve and gives 7.56% at the market price. Real = (1 + nom.) / (1 + 3.0%) − 1. Source: model v3, TIR_Implicita and TIR_Accionista sheets.</w:t>
             </w:r>
           </w:p>
           <w:p>
@@ -1310,11 +1310,51 @@
             <w:r>
               <w:rPr>
                 <w:rFonts w:ascii="Arial" w:cs="Arial" w:eastAsia="Arial" w:hAnsi="Arial"/>
-                <w:color w:val="1A1A1A"/>
-                <w:sz w:val="16"/>
-                <w:szCs w:val="16"/>
-              </w:rPr>
-              <w:t xml:space="preserve">Two assumptions deserve explanation. The cash tax rate starts at 16.8% because the company currently uses tax goodwill and loss carry-forwards; we assume those shields run off and the rate reaches 27% by 2030, so as not to overstate value. And working capital is positive because tenant receivables (CLP 122,370 million) exceed rents collected in advance (CLP 20,247 million): it grows with revenue, not with new m².</w:t>
+                <w:b/>
+                <w:bCs/>
+                <w:color w:val="1A1A1A"/>
+                <w:sz w:val="12"/>
+                <w:szCs w:val="12"/>
+                <w:shd w:fill="ECB100" w:color="auto" w:val="clear"/>
+              </w:rPr>
+              <w:t xml:space="preserve">NEW</w:t>
+            </w:r>
+            <w:r>
+              <w:rPr>
+                <w:rFonts w:ascii="Arial" w:cs="Arial" w:eastAsia="Arial" w:hAnsi="Arial"/>
+                <w:color w:val="1A1A1A"/>
+                <w:sz w:val="16"/>
+                <w:szCs w:val="16"/>
+              </w:rPr>
+              <w:t xml:space="preserve"> </w:t>
+            </w:r>
+            <w:r>
+              <w:rPr>
+                <w:rFonts w:ascii="Arial" w:cs="Arial" w:eastAsia="Arial" w:hAnsi="Arial"/>
+                <w:color w:val="1A1A1A"/>
+                <w:sz w:val="16"/>
+                <w:szCs w:val="16"/>
+              </w:rPr>
+              <w:t xml:space="preserve">Two assumptions deserve explanation. The cash tax rate starts at 16.8% because the company currently uses tax goodwill and loss carry-forwards; we assume those shields run off and the rate reaches 27% by 2030, so as not to overstate value.</w:t>
+            </w:r>
+            <w:r>
+              <w:rPr>
+                <w:rFonts w:ascii="Arial" w:cs="Arial" w:eastAsia="Arial" w:hAnsi="Arial"/>
+                <w:color w:val="1A1A1A"/>
+                <w:sz w:val="16"/>
+                <w:szCs w:val="16"/>
+                <w:shd w:fill="ECB100" w:color="auto" w:val="clear"/>
+              </w:rPr>
+              <w:t xml:space="preserve"> It is a real cash saving (it lowers current tax), not accounting: CLP 61 per share undiscounted; without it the target falls 2.1% (Figure 29).</w:t>
+            </w:r>
+            <w:r>
+              <w:rPr>
+                <w:rFonts w:ascii="Arial" w:cs="Arial" w:eastAsia="Arial" w:hAnsi="Arial"/>
+                <w:color w:val="1A1A1A"/>
+                <w:sz w:val="16"/>
+                <w:szCs w:val="16"/>
+              </w:rPr>
+              <w:t xml:space="preserve"> And working capital is positive because tenant receivables (CLP 122,370 million) exceed rents collected in advance (CLP 20,247 million): it grows with revenue, not with new m².</w:t>
             </w:r>
           </w:p>
           <w:p>
@@ -1663,11 +1703,33 @@
             <w:r>
               <w:rPr>
                 <w:rFonts w:ascii="Arial" w:cs="Arial" w:eastAsia="Arial" w:hAnsi="Arial"/>
+                <w:b/>
+                <w:bCs/>
+                <w:color w:val="14284B"/>
+                <w:sz w:val="12"/>
+                <w:szCs w:val="12"/>
+                <w:shd w:fill="ECB100" w:color="auto" w:val="clear"/>
+              </w:rPr>
+              <w:t xml:space="preserve">NEW</w:t>
+            </w:r>
+            <w:r>
+              <w:rPr>
+                <w:rFonts w:ascii="Arial" w:cs="Arial" w:eastAsia="Arial" w:hAnsi="Arial"/>
                 <w:color w:val="14284B"/>
                 <w:sz w:val="14"/>
                 <w:szCs w:val="14"/>
               </w:rPr>
-              <w:t xml:space="preserve">Working capital: an assumption that does not move the price (±1.2%)</w:t>
+              <w:t xml:space="preserve"> </w:t>
+            </w:r>
+            <w:r>
+              <w:rPr>
+                <w:rFonts w:ascii="Arial" w:cs="Arial" w:eastAsia="Arial" w:hAnsi="Arial"/>
+                <w:color w:val="14284B"/>
+                <w:sz w:val="14"/>
+                <w:szCs w:val="14"/>
+                <w:shd w:fill="ECB100" w:color="auto" w:val="clear"/>
+              </w:rPr>
+              <w:t xml:space="preserve">With every strong assumption in its favor the target reaches CLP 2,928, still 18% below the price</w:t>
             </w:r>
           </w:p>
           <w:p>
@@ -1726,7 +1788,7 @@
                 <w:sz w:val="11"/>
                 <w:szCs w:val="11"/>
               </w:rPr>
-              <w:t xml:space="preserve">Source: Mallplaza financial statements; Team analysis.</w:t>
+              <w:t xml:space="preserve">Cumulative waterfall in the order shown; the table gives each assumption on its own. Target price = 80% DCF + 20% multiples. Source: v3 DCF replica; Team analysis.</w:t>
             </w:r>
           </w:p>
           <w:p>

</xml_diff>

<commit_message>
Valuation: IRR of the new project (1 m² cohort) in TIR_Proyecto sheet, table row and text; trims to keep two pages
Co-Authored-By: Claude Sonnet 5.5 <noreply@anthropic.com>
Claude-Session: https://claude.ai/code/session_0188QZHBkA8n5QL7BtmFakQg
</commit_message>
<xml_diff>
--- a/secciones/valuacion/documento/Mallplaza_Valuacion_EN.docx
+++ b/secciones/valuacion/documento/Mallplaza_Valuacion_EN.docx
@@ -343,7 +343,7 @@
                 <w:sz w:val="16"/>
                 <w:szCs w:val="16"/>
               </w:rPr>
-              <w:t xml:space="preserve">: the US Treasury Rf, the implied equity risk premium published by Damodaran and country risk, which we weight by revenue (71.8% Chile, 17.7% Peru and 10.5% Colombia). We then convert it to pesos with the gap between expected inflation in Chile (3.0%, the central bank's target) and in the US (2.24%, 10-year breakeven). </w:t>
+              <w:t xml:space="preserve">: the US Treasury Rf, the implied equity risk premium published by Damodaran and country risk, which we weight by revenue. We then convert it to pesos with the gap between expected inflation in Chile (3.0%, the central bank's target) and in the US (2.24%, 10-year breakeven). </w:t>
             </w:r>
             <w:r>
               <w:rPr>
@@ -391,15 +391,6 @@
                 <w:shd w:fill="ECB100" w:color="auto" w:val="clear"/>
               </w:rPr>
               <w:t xml:space="preserve">The first signal is the asset IRR, what the business earns for whoever buys it at CLP 3,555 if our cash flows come true: 7.57% nominal (4.44% real in UF), 284 bp below its WACC and just ~80 bp real above its real cost of debt (Figure 28).</w:t>
-            </w:r>
-            <w:r>
-              <w:rPr>
-                <w:rFonts w:ascii="Arial" w:cs="Arial" w:eastAsia="Arial" w:hAnsi="Arial"/>
-                <w:color w:val="1A1A1A"/>
-                <w:sz w:val="16"/>
-                <w:szCs w:val="16"/>
-              </w:rPr>
-              <w:t xml:space="preserve"> The market is pricing the business almost as if it were a bond.</w:t>
             </w:r>
           </w:p>
           <w:p>
@@ -438,7 +429,7 @@
                 <w:szCs w:val="14"/>
                 <w:shd w:fill="ECB100" w:color="auto" w:val="clear"/>
               </w:rPr>
-              <w:t xml:space="preserve">Asset (firm) IRR vs its WACC: nominal CLP and real (UF)</w:t>
+              <w:t xml:space="preserve">Asset (firm) and new-project IRR vs WACC: nominal CLP and real (UF)</w:t>
             </w:r>
           </w:p>
           <w:tbl>
@@ -1196,6 +1187,193 @@
                 </w:p>
               </w:tc>
             </w:tr>
+            <w:tr>
+              <w:tc>
+                <w:tcPr>
+                  <w:tcW w:type="dxa" w:w="2300"/>
+                  <w:tcBorders>
+                    <w:top w:val="none" w:color="FFFFFF" w:sz="0"/>
+                    <w:left w:val="none" w:color="FFFFFF" w:sz="0"/>
+                    <w:bottom w:val="single" w:color="D5D9E0" w:sz="4"/>
+                    <w:right w:val="none" w:color="FFFFFF" w:sz="0"/>
+                  </w:tcBorders>
+                  <w:shd w:fill="FFFFFF" w:color="auto" w:val="clear"/>
+                  <w:tcMar>
+                    <w:top w:type="dxa" w:w="25"/>
+                    <w:left w:type="dxa" w:w="80"/>
+                    <w:bottom w:type="dxa" w:w="25"/>
+                    <w:right w:type="dxa" w:w="80"/>
+                  </w:tcMar>
+                  <w:vAlign w:val="center"/>
+                </w:tcPr>
+                <w:p>
+                  <w:pPr>
+                    <w:spacing w:line="216" w:lineRule="auto"/>
+                    <w:jc w:val="left"/>
+                  </w:pPr>
+                  <w:r>
+                    <w:rPr>
+                      <w:rFonts w:ascii="Arial" w:cs="Arial" w:eastAsia="Arial" w:hAnsi="Arial"/>
+                      <w:b w:val="false"/>
+                      <w:bCs w:val="false"/>
+                      <w:color w:val="1A1A1A"/>
+                      <w:sz w:val="13"/>
+                      <w:szCs w:val="13"/>
+                      <w:shd w:fill="ECB100" w:color="auto" w:val="clear"/>
+                    </w:rPr>
+                    <w:t xml:space="preserve">New project: 1 m² (cohort)</w:t>
+                  </w:r>
+                </w:p>
+              </w:tc>
+              <w:tc>
+                <w:tcPr>
+                  <w:tcW w:type="dxa" w:w="740"/>
+                  <w:tcBorders>
+                    <w:top w:val="none" w:color="FFFFFF" w:sz="0"/>
+                    <w:left w:val="none" w:color="FFFFFF" w:sz="0"/>
+                    <w:bottom w:val="single" w:color="D5D9E0" w:sz="4"/>
+                    <w:right w:val="none" w:color="FFFFFF" w:sz="0"/>
+                  </w:tcBorders>
+                  <w:shd w:fill="FFFFFF" w:color="auto" w:val="clear"/>
+                  <w:tcMar>
+                    <w:top w:type="dxa" w:w="25"/>
+                    <w:left w:type="dxa" w:w="80"/>
+                    <w:bottom w:type="dxa" w:w="25"/>
+                    <w:right w:type="dxa" w:w="80"/>
+                  </w:tcMar>
+                  <w:vAlign w:val="center"/>
+                </w:tcPr>
+                <w:p>
+                  <w:pPr>
+                    <w:spacing w:line="216" w:lineRule="auto"/>
+                    <w:jc w:val="right"/>
+                  </w:pPr>
+                  <w:r>
+                    <w:rPr>
+                      <w:rFonts w:ascii="Arial" w:cs="Arial" w:eastAsia="Arial" w:hAnsi="Arial"/>
+                      <w:b w:val="false"/>
+                      <w:bCs w:val="false"/>
+                      <w:color w:val="1A1A1A"/>
+                      <w:sz w:val="13"/>
+                      <w:szCs w:val="13"/>
+                      <w:shd w:fill="ECB100" w:color="auto" w:val="clear"/>
+                    </w:rPr>
+                    <w:t xml:space="preserve">7.76%</w:t>
+                  </w:r>
+                </w:p>
+              </w:tc>
+              <w:tc>
+                <w:tcPr>
+                  <w:tcW w:type="dxa" w:w="640"/>
+                  <w:tcBorders>
+                    <w:top w:val="none" w:color="FFFFFF" w:sz="0"/>
+                    <w:left w:val="none" w:color="FFFFFF" w:sz="0"/>
+                    <w:bottom w:val="single" w:color="D5D9E0" w:sz="4"/>
+                    <w:right w:val="none" w:color="FFFFFF" w:sz="0"/>
+                  </w:tcBorders>
+                  <w:shd w:fill="FFFFFF" w:color="auto" w:val="clear"/>
+                  <w:tcMar>
+                    <w:top w:type="dxa" w:w="25"/>
+                    <w:left w:type="dxa" w:w="80"/>
+                    <w:bottom w:type="dxa" w:w="25"/>
+                    <w:right w:type="dxa" w:w="80"/>
+                  </w:tcMar>
+                  <w:vAlign w:val="center"/>
+                </w:tcPr>
+                <w:p>
+                  <w:pPr>
+                    <w:spacing w:line="216" w:lineRule="auto"/>
+                    <w:jc w:val="right"/>
+                  </w:pPr>
+                  <w:r>
+                    <w:rPr>
+                      <w:rFonts w:ascii="Arial" w:cs="Arial" w:eastAsia="Arial" w:hAnsi="Arial"/>
+                      <w:b w:val="false"/>
+                      <w:bCs w:val="false"/>
+                      <w:color w:val="1A1A1A"/>
+                      <w:sz w:val="13"/>
+                      <w:szCs w:val="13"/>
+                      <w:shd w:fill="ECB100" w:color="auto" w:val="clear"/>
+                    </w:rPr>
+                    <w:t xml:space="preserve">4.62%</w:t>
+                  </w:r>
+                </w:p>
+              </w:tc>
+              <w:tc>
+                <w:tcPr>
+                  <w:tcW w:type="dxa" w:w="1800"/>
+                  <w:tcBorders>
+                    <w:top w:val="none" w:color="FFFFFF" w:sz="0"/>
+                    <w:left w:val="none" w:color="FFFFFF" w:sz="0"/>
+                    <w:bottom w:val="single" w:color="D5D9E0" w:sz="4"/>
+                    <w:right w:val="none" w:color="FFFFFF" w:sz="0"/>
+                  </w:tcBorders>
+                  <w:shd w:fill="FFFFFF" w:color="auto" w:val="clear"/>
+                  <w:tcMar>
+                    <w:top w:type="dxa" w:w="25"/>
+                    <w:left w:type="dxa" w:w="80"/>
+                    <w:bottom w:type="dxa" w:w="25"/>
+                    <w:right w:type="dxa" w:w="80"/>
+                  </w:tcMar>
+                  <w:vAlign w:val="center"/>
+                </w:tcPr>
+                <w:p>
+                  <w:pPr>
+                    <w:spacing w:line="216" w:lineRule="auto"/>
+                    <w:jc w:val="right"/>
+                  </w:pPr>
+                  <w:r>
+                    <w:rPr>
+                      <w:rFonts w:ascii="Arial" w:cs="Arial" w:eastAsia="Arial" w:hAnsi="Arial"/>
+                      <w:b w:val="false"/>
+                      <w:bCs w:val="false"/>
+                      <w:color w:val="1A1A1A"/>
+                      <w:sz w:val="13"/>
+                      <w:szCs w:val="13"/>
+                      <w:shd w:fill="ECB100" w:color="auto" w:val="clear"/>
+                    </w:rPr>
+                    <w:t xml:space="preserve">WACC 10.41% / 7.20%</w:t>
+                  </w:r>
+                </w:p>
+              </w:tc>
+              <w:tc>
+                <w:tcPr>
+                  <w:tcW w:type="dxa" w:w="1420"/>
+                  <w:tcBorders>
+                    <w:top w:val="none" w:color="FFFFFF" w:sz="0"/>
+                    <w:left w:val="none" w:color="FFFFFF" w:sz="0"/>
+                    <w:bottom w:val="single" w:color="D5D9E0" w:sz="4"/>
+                    <w:right w:val="none" w:color="FFFFFF" w:sz="0"/>
+                  </w:tcBorders>
+                  <w:shd w:fill="FFFFFF" w:color="auto" w:val="clear"/>
+                  <w:tcMar>
+                    <w:top w:type="dxa" w:w="25"/>
+                    <w:left w:type="dxa" w:w="80"/>
+                    <w:bottom w:type="dxa" w:w="25"/>
+                    <w:right w:type="dxa" w:w="80"/>
+                  </w:tcMar>
+                  <w:vAlign w:val="center"/>
+                </w:tcPr>
+                <w:p>
+                  <w:pPr>
+                    <w:spacing w:line="216" w:lineRule="auto"/>
+                    <w:jc w:val="right"/>
+                  </w:pPr>
+                  <w:r>
+                    <w:rPr>
+                      <w:rFonts w:ascii="Arial" w:cs="Arial" w:eastAsia="Arial" w:hAnsi="Arial"/>
+                      <w:b w:val="false"/>
+                      <w:bCs w:val="false"/>
+                      <w:color w:val="1A1A1A"/>
+                      <w:sz w:val="13"/>
+                      <w:szCs w:val="13"/>
+                      <w:shd w:fill="ECB100" w:color="auto" w:val="clear"/>
+                    </w:rPr>
+                    <w:t xml:space="preserve">−265 / −257 bp</w:t>
+                  </w:r>
+                </w:p>
+              </w:tc>
+            </w:tr>
           </w:tbl>
           <w:p>
             <w:pPr>
@@ -1210,7 +1388,7 @@
                 <w:szCs w:val="11"/>
                 <w:shd w:fill="ECB100" w:color="auto" w:val="clear"/>
               </w:rPr>
-              <w:t xml:space="preserve">Asset IRR: the single rate that equates FCFF and terminal value to the enterprise value paid (price × shares + net debt + minorities). At the DCF value it equals the WACC. Figure 34 shifts the whole WACC curve and gives 7.56% at the market price. Real = (1 + nom.) / (1 + 3.0%) − 1. Source: model v3, TIR_Implicita and TIR_Accionista sheets.</w:t>
+              <w:t xml:space="preserve">Asset IRR: the single rate that equates FCFF and terminal value to the enterprise value paid. At the DCF value it equals the WACC. New project: cash flow of 1 m² with the expansion cost, ramp and margin, maintenance and working capital. Real = (1 + nom.) / (1 + 3.0%) − 1. Source: model v3, TIR_Implicita and TIR_Proyecto sheets.</w:t>
             </w:r>
           </w:p>
           <w:p>
@@ -1335,7 +1513,7 @@
                 <w:sz w:val="16"/>
                 <w:szCs w:val="16"/>
               </w:rPr>
-              <w:t xml:space="preserve">Two assumptions deserve explanation. The cash tax rate starts at 16.8% because the company currently uses tax goodwill and loss carry-forwards; we assume those shields run off and the rate reaches 27% by 2030, so as not to overstate value.</w:t>
+              <w:t xml:space="preserve">Two assumptions deserve explanation. The cash tax rate starts at 16.8% because the company currently uses tax goodwill and loss carry-forwards; we assume those shields run off and the rate reaches 27% by 2030.</w:t>
             </w:r>
             <w:r>
               <w:rPr>
@@ -1354,7 +1532,7 @@
                 <w:sz w:val="16"/>
                 <w:szCs w:val="16"/>
               </w:rPr>
-              <w:t xml:space="preserve"> And working capital is positive because tenant receivables (CLP 122,370 million) exceed rents collected in advance (CLP 20,247 million): it grows with revenue, not with new m².</w:t>
+              <w:t xml:space="preserve"> And working capital grows with revenue, not with new m².</w:t>
             </w:r>
           </w:p>
           <w:p>
@@ -1409,7 +1587,26 @@
                 <w:sz w:val="16"/>
                 <w:szCs w:val="16"/>
               </w:rPr>
-              <w:t xml:space="preserve"> on cost, a 5.0% real RONIC after tax, below a 7.2% real WACC. Expansion adds revenue but not value, so terminal value grows only with inflation (g of 3.0% nominal, 0% real) and a higher g lowers value (Figure 30). Assuming more growth would not close the gap with the price; it would widen it.</w:t>
+              <w:t xml:space="preserve"> on cost, a 5.0% real RONIC after tax, below a 7.2% real WACC.</w:t>
+            </w:r>
+            <w:r>
+              <w:rPr>
+                <w:rFonts w:ascii="Arial" w:cs="Arial" w:eastAsia="Arial" w:hAnsi="Arial"/>
+                <w:color w:val="1A1A1A"/>
+                <w:sz w:val="16"/>
+                <w:szCs w:val="16"/>
+                <w:shd w:fill="ECB100" w:color="auto" w:val="clear"/>
+              </w:rPr>
+              <w:t xml:space="preserve"> The IRR of a new m² is 4.62% real (7.76% nominal), 257 bp below the WACC.</w:t>
+            </w:r>
+            <w:r>
+              <w:rPr>
+                <w:rFonts w:ascii="Arial" w:cs="Arial" w:eastAsia="Arial" w:hAnsi="Arial"/>
+                <w:color w:val="1A1A1A"/>
+                <w:sz w:val="16"/>
+                <w:szCs w:val="16"/>
+              </w:rPr>
+              <w:t xml:space="preserve"> Expansion adds revenue but not value, so terminal value grows only with inflation (g of 3.0% nominal, 0% real) and a higher g lowers value (Figure 30). Assuming more growth would not close the gap with the price; it would widen it.</w:t>
             </w:r>
           </w:p>
           <w:p>

</xml_diff>

<commit_message>
Valuation: project IRR sentence expanded, project row highlighted, taller assumptions waterfall, shorter value-driver figure
Co-Authored-By: Claude Sonnet 5.5 <noreply@anthropic.com>
Claude-Session: https://claude.ai/code/session_0188QZHBkA8n5QL7BtmFakQg
</commit_message>
<xml_diff>
--- a/secciones/valuacion/documento/Mallplaza_Valuacion_EN.docx
+++ b/secciones/valuacion/documento/Mallplaza_Valuacion_EN.docx
@@ -636,7 +636,7 @@
                     <w:bottom w:val="single" w:color="D5D9E0" w:sz="4"/>
                     <w:right w:val="none" w:color="FFFFFF" w:sz="0"/>
                   </w:tcBorders>
-                  <w:shd w:fill="FDF1CC" w:color="auto" w:val="clear"/>
+                  <w:shd w:fill="F7F8FB" w:color="auto" w:val="clear"/>
                   <w:tcMar>
                     <w:top w:type="dxa" w:w="25"/>
                     <w:left w:type="dxa" w:w="80"/>
@@ -653,8 +653,8 @@
                   <w:r>
                     <w:rPr>
                       <w:rFonts w:ascii="Arial" w:cs="Arial" w:eastAsia="Arial" w:hAnsi="Arial"/>
-                      <w:b/>
-                      <w:bCs/>
+                      <w:b w:val="false"/>
+                      <w:bCs w:val="false"/>
                       <w:color w:val="1A1A1A"/>
                       <w:sz w:val="13"/>
                       <w:szCs w:val="13"/>
@@ -673,7 +673,7 @@
                     <w:bottom w:val="single" w:color="D5D9E0" w:sz="4"/>
                     <w:right w:val="none" w:color="FFFFFF" w:sz="0"/>
                   </w:tcBorders>
-                  <w:shd w:fill="FDF1CC" w:color="auto" w:val="clear"/>
+                  <w:shd w:fill="F7F8FB" w:color="auto" w:val="clear"/>
                   <w:tcMar>
                     <w:top w:type="dxa" w:w="25"/>
                     <w:left w:type="dxa" w:w="80"/>
@@ -690,8 +690,8 @@
                   <w:r>
                     <w:rPr>
                       <w:rFonts w:ascii="Arial" w:cs="Arial" w:eastAsia="Arial" w:hAnsi="Arial"/>
-                      <w:b/>
-                      <w:bCs/>
+                      <w:b w:val="false"/>
+                      <w:bCs w:val="false"/>
                       <w:color w:val="1A1A1A"/>
                       <w:sz w:val="13"/>
                       <w:szCs w:val="13"/>
@@ -710,7 +710,7 @@
                     <w:bottom w:val="single" w:color="D5D9E0" w:sz="4"/>
                     <w:right w:val="none" w:color="FFFFFF" w:sz="0"/>
                   </w:tcBorders>
-                  <w:shd w:fill="FDF1CC" w:color="auto" w:val="clear"/>
+                  <w:shd w:fill="F7F8FB" w:color="auto" w:val="clear"/>
                   <w:tcMar>
                     <w:top w:type="dxa" w:w="25"/>
                     <w:left w:type="dxa" w:w="80"/>
@@ -727,8 +727,8 @@
                   <w:r>
                     <w:rPr>
                       <w:rFonts w:ascii="Arial" w:cs="Arial" w:eastAsia="Arial" w:hAnsi="Arial"/>
-                      <w:b/>
-                      <w:bCs/>
+                      <w:b w:val="false"/>
+                      <w:bCs w:val="false"/>
                       <w:color w:val="1A1A1A"/>
                       <w:sz w:val="13"/>
                       <w:szCs w:val="13"/>
@@ -747,7 +747,7 @@
                     <w:bottom w:val="single" w:color="D5D9E0" w:sz="4"/>
                     <w:right w:val="none" w:color="FFFFFF" w:sz="0"/>
                   </w:tcBorders>
-                  <w:shd w:fill="FDF1CC" w:color="auto" w:val="clear"/>
+                  <w:shd w:fill="F7F8FB" w:color="auto" w:val="clear"/>
                   <w:tcMar>
                     <w:top w:type="dxa" w:w="25"/>
                     <w:left w:type="dxa" w:w="80"/>
@@ -764,8 +764,8 @@
                   <w:r>
                     <w:rPr>
                       <w:rFonts w:ascii="Arial" w:cs="Arial" w:eastAsia="Arial" w:hAnsi="Arial"/>
-                      <w:b/>
-                      <w:bCs/>
+                      <w:b w:val="false"/>
+                      <w:bCs w:val="false"/>
                       <w:color w:val="1A1A1A"/>
                       <w:sz w:val="13"/>
                       <w:szCs w:val="13"/>
@@ -784,7 +784,7 @@
                     <w:bottom w:val="single" w:color="D5D9E0" w:sz="4"/>
                     <w:right w:val="none" w:color="FFFFFF" w:sz="0"/>
                   </w:tcBorders>
-                  <w:shd w:fill="FDF1CC" w:color="auto" w:val="clear"/>
+                  <w:shd w:fill="F7F8FB" w:color="auto" w:val="clear"/>
                   <w:tcMar>
                     <w:top w:type="dxa" w:w="25"/>
                     <w:left w:type="dxa" w:w="80"/>
@@ -801,8 +801,8 @@
                   <w:r>
                     <w:rPr>
                       <w:rFonts w:ascii="Arial" w:cs="Arial" w:eastAsia="Arial" w:hAnsi="Arial"/>
-                      <w:b/>
-                      <w:bCs/>
+                      <w:b w:val="false"/>
+                      <w:bCs w:val="false"/>
                       <w:color w:val="1A1A1A"/>
                       <w:sz w:val="13"/>
                       <w:szCs w:val="13"/>
@@ -1197,7 +1197,7 @@
                     <w:bottom w:val="single" w:color="D5D9E0" w:sz="4"/>
                     <w:right w:val="none" w:color="FFFFFF" w:sz="0"/>
                   </w:tcBorders>
-                  <w:shd w:fill="FFFFFF" w:color="auto" w:val="clear"/>
+                  <w:shd w:fill="FDF1CC" w:color="auto" w:val="clear"/>
                   <w:tcMar>
                     <w:top w:type="dxa" w:w="25"/>
                     <w:left w:type="dxa" w:w="80"/>
@@ -1214,8 +1214,8 @@
                   <w:r>
                     <w:rPr>
                       <w:rFonts w:ascii="Arial" w:cs="Arial" w:eastAsia="Arial" w:hAnsi="Arial"/>
-                      <w:b w:val="false"/>
-                      <w:bCs w:val="false"/>
+                      <w:b/>
+                      <w:bCs/>
                       <w:color w:val="1A1A1A"/>
                       <w:sz w:val="13"/>
                       <w:szCs w:val="13"/>
@@ -1234,7 +1234,7 @@
                     <w:bottom w:val="single" w:color="D5D9E0" w:sz="4"/>
                     <w:right w:val="none" w:color="FFFFFF" w:sz="0"/>
                   </w:tcBorders>
-                  <w:shd w:fill="FFFFFF" w:color="auto" w:val="clear"/>
+                  <w:shd w:fill="FDF1CC" w:color="auto" w:val="clear"/>
                   <w:tcMar>
                     <w:top w:type="dxa" w:w="25"/>
                     <w:left w:type="dxa" w:w="80"/>
@@ -1251,8 +1251,8 @@
                   <w:r>
                     <w:rPr>
                       <w:rFonts w:ascii="Arial" w:cs="Arial" w:eastAsia="Arial" w:hAnsi="Arial"/>
-                      <w:b w:val="false"/>
-                      <w:bCs w:val="false"/>
+                      <w:b/>
+                      <w:bCs/>
                       <w:color w:val="1A1A1A"/>
                       <w:sz w:val="13"/>
                       <w:szCs w:val="13"/>
@@ -1271,7 +1271,7 @@
                     <w:bottom w:val="single" w:color="D5D9E0" w:sz="4"/>
                     <w:right w:val="none" w:color="FFFFFF" w:sz="0"/>
                   </w:tcBorders>
-                  <w:shd w:fill="FFFFFF" w:color="auto" w:val="clear"/>
+                  <w:shd w:fill="FDF1CC" w:color="auto" w:val="clear"/>
                   <w:tcMar>
                     <w:top w:type="dxa" w:w="25"/>
                     <w:left w:type="dxa" w:w="80"/>
@@ -1288,8 +1288,8 @@
                   <w:r>
                     <w:rPr>
                       <w:rFonts w:ascii="Arial" w:cs="Arial" w:eastAsia="Arial" w:hAnsi="Arial"/>
-                      <w:b w:val="false"/>
-                      <w:bCs w:val="false"/>
+                      <w:b/>
+                      <w:bCs/>
                       <w:color w:val="1A1A1A"/>
                       <w:sz w:val="13"/>
                       <w:szCs w:val="13"/>
@@ -1308,7 +1308,7 @@
                     <w:bottom w:val="single" w:color="D5D9E0" w:sz="4"/>
                     <w:right w:val="none" w:color="FFFFFF" w:sz="0"/>
                   </w:tcBorders>
-                  <w:shd w:fill="FFFFFF" w:color="auto" w:val="clear"/>
+                  <w:shd w:fill="FDF1CC" w:color="auto" w:val="clear"/>
                   <w:tcMar>
                     <w:top w:type="dxa" w:w="25"/>
                     <w:left w:type="dxa" w:w="80"/>
@@ -1325,8 +1325,8 @@
                   <w:r>
                     <w:rPr>
                       <w:rFonts w:ascii="Arial" w:cs="Arial" w:eastAsia="Arial" w:hAnsi="Arial"/>
-                      <w:b w:val="false"/>
-                      <w:bCs w:val="false"/>
+                      <w:b/>
+                      <w:bCs/>
                       <w:color w:val="1A1A1A"/>
                       <w:sz w:val="13"/>
                       <w:szCs w:val="13"/>
@@ -1345,7 +1345,7 @@
                     <w:bottom w:val="single" w:color="D5D9E0" w:sz="4"/>
                     <w:right w:val="none" w:color="FFFFFF" w:sz="0"/>
                   </w:tcBorders>
-                  <w:shd w:fill="FFFFFF" w:color="auto" w:val="clear"/>
+                  <w:shd w:fill="FDF1CC" w:color="auto" w:val="clear"/>
                   <w:tcMar>
                     <w:top w:type="dxa" w:w="25"/>
                     <w:left w:type="dxa" w:w="80"/>
@@ -1362,8 +1362,8 @@
                   <w:r>
                     <w:rPr>
                       <w:rFonts w:ascii="Arial" w:cs="Arial" w:eastAsia="Arial" w:hAnsi="Arial"/>
-                      <w:b w:val="false"/>
-                      <w:bCs w:val="false"/>
+                      <w:b/>
+                      <w:bCs/>
                       <w:color w:val="1A1A1A"/>
                       <w:sz w:val="13"/>
                       <w:szCs w:val="13"/>
@@ -1597,7 +1597,7 @@
                 <w:szCs w:val="16"/>
                 <w:shd w:fill="ECB100" w:color="auto" w:val="clear"/>
               </w:rPr>
-              <w:t xml:space="preserve"> The IRR of a new m² is 4.62% real (7.76% nominal), 257 bp below the WACC.</w:t>
+              <w:t xml:space="preserve"> The IRR of a new m², with capex, ramp, maintenance and working capital, is 4.62% real (7.76% nominal): 257 bp below the real WACC and 265 bp below the nominal one.</w:t>
             </w:r>
             <w:r>
               <w:rPr>
@@ -1617,42 +1617,11 @@
             <w:r>
               <w:rPr>
                 <w:rFonts w:ascii="Arial" w:cs="Arial" w:eastAsia="Arial" w:hAnsi="Arial"/>
-                <w:b/>
-                <w:bCs/>
-                <w:color w:val="1A1A1A"/>
-                <w:sz w:val="12"/>
-                <w:szCs w:val="12"/>
-                <w:shd w:fill="ECB100" w:color="auto" w:val="clear"/>
-              </w:rPr>
-              <w:t xml:space="preserve">NEW</w:t>
-            </w:r>
-            <w:r>
-              <w:rPr>
-                <w:rFonts w:ascii="Arial" w:cs="Arial" w:eastAsia="Arial" w:hAnsi="Arial"/>
-                <w:color w:val="1A1A1A"/>
-                <w:sz w:val="16"/>
-                <w:szCs w:val="16"/>
-              </w:rPr>
-              <w:t xml:space="preserve"> </w:t>
-            </w:r>
-            <w:r>
-              <w:rPr>
-                <w:rFonts w:ascii="Arial" w:cs="Arial" w:eastAsia="Arial" w:hAnsi="Arial"/>
-                <w:color w:val="1A1A1A"/>
-                <w:sz w:val="16"/>
-                <w:szCs w:val="16"/>
-              </w:rPr>
-              <w:t xml:space="preserve">That is why the explicit horizon includes the capex and ramp-up of projects opening through 2032 (108,301 m² of mature GLA in the terminal year), but from then on the model adds no new malls: terminal capex covers maintenance only (5.5% of revenue). </w:t>
-            </w:r>
-            <w:r>
-              <w:rPr>
-                <w:rFonts w:ascii="Arial" w:cs="Arial" w:eastAsia="Arial" w:hAnsi="Arial"/>
-                <w:color w:val="1A1A1A"/>
-                <w:sz w:val="16"/>
-                <w:szCs w:val="16"/>
-                <w:shd w:fill="ECB100" w:color="auto" w:val="clear"/>
-              </w:rPr>
-              <w:t xml:space="preserve">At these returns, growing more would reduce its value.</w:t>
+                <w:color w:val="1A1A1A"/>
+                <w:sz w:val="16"/>
+                <w:szCs w:val="16"/>
+              </w:rPr>
+              <w:t xml:space="preserve">That is why the explicit horizon includes the capex and ramp-up of projects opening through 2032 (108,301 m² of mature GLA in the terminal year), but from then on the model adds no new malls: terminal capex covers maintenance only (5.5% of revenue).</w:t>
             </w:r>
           </w:p>
         </w:tc>
@@ -1936,7 +1905,7 @@
             <w:r>
               <w:drawing>
                 <wp:inline distT="0" distB="0" distL="0" distR="0">
-                  <wp:extent cx="2257425" cy="1647825"/>
+                  <wp:extent cx="2257425" cy="2105025"/>
                   <wp:effectExtent t="0" r="0" b="0" l="0"/>
                   <wp:docPr id="1" name="" descr="" title=""/>
                   <wp:cNvGraphicFramePr>
@@ -1961,7 +1930,7 @@
                         <pic:spPr bwMode="auto">
                           <a:xfrm>
                             <a:off x="0" y="0"/>
-                            <a:ext cx="2257425" cy="1647825"/>
+                            <a:ext cx="2257425" cy="2105025"/>
                           </a:xfrm>
                           <a:prstGeom prst="rect">
                             <a:avLst/>
@@ -2020,7 +1989,7 @@
             <w:r>
               <w:drawing>
                 <wp:inline distT="0" distB="0" distL="0" distR="0">
-                  <wp:extent cx="2257425" cy="1876425"/>
+                  <wp:extent cx="2257425" cy="1466850"/>
                   <wp:effectExtent t="0" r="0" b="0" l="0"/>
                   <wp:docPr id="1" name="" descr="" title=""/>
                   <wp:cNvGraphicFramePr>
@@ -2045,7 +2014,7 @@
                         <pic:spPr bwMode="auto">
                           <a:xfrm>
                             <a:off x="0" y="0"/>
-                            <a:ext cx="2257425" cy="1876425"/>
+                            <a:ext cx="2257425" cy="1466850"/>
                           </a:xfrm>
                           <a:prstGeom prst="rect">
                             <a:avLst/>

</xml_diff>